<commit_message>
docs: update PRD with H5 and auth progress
</commit_message>
<xml_diff>
--- a/村超MiniApp产品PRD.docx
+++ b/村超MiniApp产品PRD.docx
@@ -22,12 +22,10 @@
       </w:pPr>
       <w:r>
         <w:rPr>
-          <w:rFonts w:ascii="Arial" w:hAnsi="Arial" w:eastAsia="Microsoft YaHei"/>
-          <w:b w:val="0"/>
-          <w:color w:val="555555"/>
-          <w:sz w:val="19"/>
+          <w:rFonts w:ascii="Arial" w:hAnsi="Arial"/>
+          <w:sz w:val="21"/>
         </w:rPr>
-        <w:t>版本：v0.1｜日期：2026-06-13｜阶段：立项 / MVP 定义</w:t>
+        <w:t>版本：v0.2｜日期：2026-06-16｜阶段：MVP 原型开发 / 真实登录接入</w:t>
       </w:r>
     </w:p>
     <w:p>
@@ -7915,6 +7913,3446 @@
         <w:t>中国“村超”及各地业余足球联赛综合研究报告：补充苏超、青超、赣超、川超、渝超等多联赛布局依据。/Users/blake/Downloads/中国“村超”及各地业余足球联赛综合研究报告.md</w:t>
       </w:r>
     </w:p>
+    <w:p>
+      <w:r>
+        <w:br w:type="page"/>
+      </w:r>
+    </w:p>
+    <w:p>
+      <w:pPr>
+        <w:pStyle w:val="Heading1"/>
+      </w:pPr>
+      <w:r>
+        <w:t>16. 2026-06-16 版本进展与功能补充（H5 / API / 账号体系）</w:t>
+      </w:r>
+    </w:p>
+    <w:p>
+      <w:r>
+        <w:t>本节记录自上次 PRD 与 UI 设计稿同步后，产品从“设计原型”进入“可点击 H5 + API 预留 + 自动数据更新 + APK 包装”的新增范围。后续产品、前后端和运营文档以本节作为 v0.2 增量依据。</w:t>
+      </w:r>
+    </w:p>
+    <w:p>
+      <w:pPr>
+        <w:pStyle w:val="Heading2"/>
+      </w:pPr>
+      <w:r>
+        <w:t>16.1 当前可用版本与部署状态</w:t>
+      </w:r>
+    </w:p>
+    <w:tbl>
+      <w:tblPr>
+        <w:tblStyle w:val="TableGrid"/>
+        <w:tblW w:type="auto" w:w="0"/>
+        <w:tblLayout w:type="autofit"/>
+        <w:tblLook w:firstColumn="1" w:firstRow="1" w:lastColumn="0" w:lastRow="0" w:noHBand="0" w:noVBand="1" w:val="04A0"/>
+      </w:tblPr>
+      <w:tblGrid>
+        <w:gridCol w:w="3293"/>
+        <w:gridCol w:w="3293"/>
+        <w:gridCol w:w="3293"/>
+      </w:tblGrid>
+      <w:tr>
+        <w:tc>
+          <w:tcPr>
+            <w:tcW w:type="dxa" w:w="3293"/>
+          </w:tcPr>
+          <w:p>
+            <w:pPr>
+              <w:jc w:val="left"/>
+            </w:pPr>
+            <w:r/>
+            <w:r>
+              <w:rPr>
+                <w:rFonts w:ascii="Arial" w:hAnsi="Arial"/>
+                <w:b/>
+                <w:sz w:val="18"/>
+              </w:rPr>
+              <w:t>项目</w:t>
+            </w:r>
+          </w:p>
+        </w:tc>
+        <w:tc>
+          <w:tcPr>
+            <w:tcW w:type="dxa" w:w="3293"/>
+          </w:tcPr>
+          <w:p>
+            <w:pPr>
+              <w:jc w:val="left"/>
+            </w:pPr>
+            <w:r/>
+            <w:r>
+              <w:rPr>
+                <w:rFonts w:ascii="Arial" w:hAnsi="Arial"/>
+                <w:b/>
+                <w:sz w:val="18"/>
+              </w:rPr>
+              <w:t>当前状态</w:t>
+            </w:r>
+          </w:p>
+        </w:tc>
+        <w:tc>
+          <w:tcPr>
+            <w:tcW w:type="dxa" w:w="3293"/>
+          </w:tcPr>
+          <w:p>
+            <w:pPr>
+              <w:jc w:val="left"/>
+            </w:pPr>
+            <w:r/>
+            <w:r>
+              <w:rPr>
+                <w:rFonts w:ascii="Arial" w:hAnsi="Arial"/>
+                <w:b/>
+                <w:sz w:val="18"/>
+              </w:rPr>
+              <w:t>说明</w:t>
+            </w:r>
+          </w:p>
+        </w:tc>
+      </w:tr>
+      <w:tr>
+        <w:tc>
+          <w:tcPr>
+            <w:tcW w:type="dxa" w:w="3293"/>
+          </w:tcPr>
+          <w:p>
+            <w:pPr>
+              <w:jc w:val="left"/>
+            </w:pPr>
+            <w:r/>
+            <w:r>
+              <w:rPr>
+                <w:rFonts w:ascii="Arial" w:hAnsi="Arial"/>
+                <w:b w:val="0"/>
+                <w:sz w:val="18"/>
+              </w:rPr>
+              <w:t>H5 测试版</w:t>
+            </w:r>
+          </w:p>
+        </w:tc>
+        <w:tc>
+          <w:tcPr>
+            <w:tcW w:type="dxa" w:w="3293"/>
+          </w:tcPr>
+          <w:p>
+            <w:pPr>
+              <w:jc w:val="left"/>
+            </w:pPr>
+            <w:r/>
+            <w:r>
+              <w:rPr>
+                <w:rFonts w:ascii="Arial" w:hAnsi="Arial"/>
+                <w:b w:val="0"/>
+                <w:sz w:val="18"/>
+              </w:rPr>
+              <w:t>已部署</w:t>
+            </w:r>
+          </w:p>
+        </w:tc>
+        <w:tc>
+          <w:tcPr>
+            <w:tcW w:type="dxa" w:w="3293"/>
+          </w:tcPr>
+          <w:p>
+            <w:pPr>
+              <w:jc w:val="left"/>
+            </w:pPr>
+            <w:r/>
+            <w:r>
+              <w:rPr>
+                <w:rFonts w:ascii="Arial" w:hAnsi="Arial"/>
+                <w:b w:val="0"/>
+                <w:sz w:val="18"/>
+              </w:rPr>
+              <w:t>Vercel 测试地址为 https://cunchao-static.vercel.app，用于日常体验和合作方评审。</w:t>
+            </w:r>
+          </w:p>
+        </w:tc>
+      </w:tr>
+      <w:tr>
+        <w:tc>
+          <w:tcPr>
+            <w:tcW w:type="dxa" w:w="3293"/>
+          </w:tcPr>
+          <w:p>
+            <w:pPr>
+              <w:jc w:val="left"/>
+            </w:pPr>
+            <w:r/>
+            <w:r>
+              <w:rPr>
+                <w:rFonts w:ascii="Arial" w:hAnsi="Arial"/>
+                <w:b w:val="0"/>
+                <w:sz w:val="18"/>
+              </w:rPr>
+              <w:t>前端技术栈</w:t>
+            </w:r>
+          </w:p>
+        </w:tc>
+        <w:tc>
+          <w:tcPr>
+            <w:tcW w:type="dxa" w:w="3293"/>
+          </w:tcPr>
+          <w:p>
+            <w:pPr>
+              <w:jc w:val="left"/>
+            </w:pPr>
+            <w:r/>
+            <w:r>
+              <w:rPr>
+                <w:rFonts w:ascii="Arial" w:hAnsi="Arial"/>
+                <w:b w:val="0"/>
+                <w:sz w:val="18"/>
+              </w:rPr>
+              <w:t>已确定</w:t>
+            </w:r>
+          </w:p>
+        </w:tc>
+        <w:tc>
+          <w:tcPr>
+            <w:tcW w:type="dxa" w:w="3293"/>
+          </w:tcPr>
+          <w:p>
+            <w:pPr>
+              <w:jc w:val="left"/>
+            </w:pPr>
+            <w:r/>
+            <w:r>
+              <w:rPr>
+                <w:rFonts w:ascii="Arial" w:hAnsi="Arial"/>
+                <w:b w:val="0"/>
+                <w:sz w:val="18"/>
+              </w:rPr>
+              <w:t>React + Vite，按数据层、业务状态、页面组合、组件样式分层，便于迁移 App / 小程序。</w:t>
+            </w:r>
+          </w:p>
+        </w:tc>
+      </w:tr>
+      <w:tr>
+        <w:tc>
+          <w:tcPr>
+            <w:tcW w:type="dxa" w:w="3293"/>
+          </w:tcPr>
+          <w:p>
+            <w:pPr>
+              <w:jc w:val="left"/>
+            </w:pPr>
+            <w:r/>
+            <w:r>
+              <w:rPr>
+                <w:rFonts w:ascii="Arial" w:hAnsi="Arial"/>
+                <w:b w:val="0"/>
+                <w:sz w:val="18"/>
+              </w:rPr>
+              <w:t>Android APK</w:t>
+            </w:r>
+          </w:p>
+        </w:tc>
+        <w:tc>
+          <w:tcPr>
+            <w:tcW w:type="dxa" w:w="3293"/>
+          </w:tcPr>
+          <w:p>
+            <w:pPr>
+              <w:jc w:val="left"/>
+            </w:pPr>
+            <w:r/>
+            <w:r>
+              <w:rPr>
+                <w:rFonts w:ascii="Arial" w:hAnsi="Arial"/>
+                <w:b w:val="0"/>
+                <w:sz w:val="18"/>
+              </w:rPr>
+              <w:t>已打包过测试包</w:t>
+            </w:r>
+          </w:p>
+        </w:tc>
+        <w:tc>
+          <w:tcPr>
+            <w:tcW w:type="dxa" w:w="3293"/>
+          </w:tcPr>
+          <w:p>
+            <w:pPr>
+              <w:jc w:val="left"/>
+            </w:pPr>
+            <w:r/>
+            <w:r>
+              <w:rPr>
+                <w:rFonts w:ascii="Arial" w:hAnsi="Arial"/>
+                <w:b w:val="0"/>
+                <w:sz w:val="18"/>
+              </w:rPr>
+              <w:t>当前 APK 以 WebView/Capacitor 包装线上 H5，因此内容会随线上 H5 和静态数据更新。</w:t>
+            </w:r>
+          </w:p>
+        </w:tc>
+      </w:tr>
+      <w:tr>
+        <w:tc>
+          <w:tcPr>
+            <w:tcW w:type="dxa" w:w="3293"/>
+          </w:tcPr>
+          <w:p>
+            <w:pPr>
+              <w:jc w:val="left"/>
+            </w:pPr>
+            <w:r/>
+            <w:r>
+              <w:rPr>
+                <w:rFonts w:ascii="Arial" w:hAnsi="Arial"/>
+                <w:b w:val="0"/>
+                <w:sz w:val="18"/>
+              </w:rPr>
+              <w:t>后端 API</w:t>
+            </w:r>
+          </w:p>
+        </w:tc>
+        <w:tc>
+          <w:tcPr>
+            <w:tcW w:type="dxa" w:w="3293"/>
+          </w:tcPr>
+          <w:p>
+            <w:pPr>
+              <w:jc w:val="left"/>
+            </w:pPr>
+            <w:r/>
+            <w:r>
+              <w:rPr>
+                <w:rFonts w:ascii="Arial" w:hAnsi="Arial"/>
+                <w:b w:val="0"/>
+                <w:sz w:val="18"/>
+              </w:rPr>
+              <w:t>已搭建基础服务</w:t>
+            </w:r>
+          </w:p>
+        </w:tc>
+        <w:tc>
+          <w:tcPr>
+            <w:tcW w:type="dxa" w:w="3293"/>
+          </w:tcPr>
+          <w:p>
+            <w:pPr>
+              <w:jc w:val="left"/>
+            </w:pPr>
+            <w:r/>
+            <w:r>
+              <w:rPr>
+                <w:rFonts w:ascii="Arial" w:hAnsi="Arial"/>
+                <w:b w:val="0"/>
+                <w:sz w:val="18"/>
+              </w:rPr>
+              <w:t>Fastify API 已预留赛事、球队、内容、帖子、预约和账号接口。</w:t>
+            </w:r>
+          </w:p>
+        </w:tc>
+      </w:tr>
+      <w:tr>
+        <w:tc>
+          <w:tcPr>
+            <w:tcW w:type="dxa" w:w="3293"/>
+          </w:tcPr>
+          <w:p>
+            <w:pPr>
+              <w:jc w:val="left"/>
+            </w:pPr>
+            <w:r/>
+            <w:r>
+              <w:rPr>
+                <w:rFonts w:ascii="Arial" w:hAnsi="Arial"/>
+                <w:b w:val="0"/>
+                <w:sz w:val="18"/>
+              </w:rPr>
+              <w:t>GitHub 仓库</w:t>
+            </w:r>
+          </w:p>
+        </w:tc>
+        <w:tc>
+          <w:tcPr>
+            <w:tcW w:type="dxa" w:w="3293"/>
+          </w:tcPr>
+          <w:p>
+            <w:pPr>
+              <w:jc w:val="left"/>
+            </w:pPr>
+            <w:r/>
+            <w:r>
+              <w:rPr>
+                <w:rFonts w:ascii="Arial" w:hAnsi="Arial"/>
+                <w:b w:val="0"/>
+                <w:sz w:val="18"/>
+              </w:rPr>
+              <w:t>已接入</w:t>
+            </w:r>
+          </w:p>
+        </w:tc>
+        <w:tc>
+          <w:tcPr>
+            <w:tcW w:type="dxa" w:w="3293"/>
+          </w:tcPr>
+          <w:p>
+            <w:pPr>
+              <w:jc w:val="left"/>
+            </w:pPr>
+            <w:r/>
+            <w:r>
+              <w:rPr>
+                <w:rFonts w:ascii="Arial" w:hAnsi="Arial"/>
+                <w:b w:val="0"/>
+                <w:sz w:val="18"/>
+              </w:rPr>
+              <w:t>代码、数据更新脚本、自动化工作流均进入仓库管理。</w:t>
+            </w:r>
+          </w:p>
+        </w:tc>
+      </w:tr>
+      <w:tr>
+        <w:tc>
+          <w:tcPr>
+            <w:tcW w:type="dxa" w:w="3293"/>
+          </w:tcPr>
+          <w:p>
+            <w:pPr>
+              <w:jc w:val="left"/>
+            </w:pPr>
+            <w:r/>
+            <w:r>
+              <w:rPr>
+                <w:rFonts w:ascii="Arial" w:hAnsi="Arial"/>
+                <w:b w:val="0"/>
+                <w:sz w:val="18"/>
+              </w:rPr>
+              <w:t>国内访问方案</w:t>
+            </w:r>
+          </w:p>
+        </w:tc>
+        <w:tc>
+          <w:tcPr>
+            <w:tcW w:type="dxa" w:w="3293"/>
+          </w:tcPr>
+          <w:p>
+            <w:pPr>
+              <w:jc w:val="left"/>
+            </w:pPr>
+            <w:r/>
+            <w:r>
+              <w:rPr>
+                <w:rFonts w:ascii="Arial" w:hAnsi="Arial"/>
+                <w:b w:val="0"/>
+                <w:sz w:val="18"/>
+              </w:rPr>
+              <w:t>已有文档</w:t>
+            </w:r>
+          </w:p>
+        </w:tc>
+        <w:tc>
+          <w:tcPr>
+            <w:tcW w:type="dxa" w:w="3293"/>
+          </w:tcPr>
+          <w:p>
+            <w:pPr>
+              <w:jc w:val="left"/>
+            </w:pPr>
+            <w:r/>
+            <w:r>
+              <w:rPr>
+                <w:rFonts w:ascii="Arial" w:hAnsi="Arial"/>
+                <w:b w:val="0"/>
+                <w:sz w:val="18"/>
+              </w:rPr>
+              <w:t>Vercel 在中国大陆访问不稳定，正式测试建议国内 OSS/COS + CDN 或香港节点过渡。</w:t>
+            </w:r>
+          </w:p>
+        </w:tc>
+      </w:tr>
+    </w:tbl>
+    <w:p/>
+    <w:p>
+      <w:pPr>
+        <w:pStyle w:val="Heading2"/>
+      </w:pPr>
+      <w:r>
+        <w:t>16.2 H5 首版体验优化</w:t>
+      </w:r>
+    </w:p>
+    <w:tbl>
+      <w:tblPr>
+        <w:tblStyle w:val="TableGrid"/>
+        <w:tblW w:type="auto" w:w="0"/>
+        <w:tblLayout w:type="autofit"/>
+        <w:tblLook w:firstColumn="1" w:firstRow="1" w:lastColumn="0" w:lastRow="0" w:noHBand="0" w:noVBand="1" w:val="04A0"/>
+      </w:tblPr>
+      <w:tblGrid>
+        <w:gridCol w:w="3293"/>
+        <w:gridCol w:w="3293"/>
+        <w:gridCol w:w="3293"/>
+      </w:tblGrid>
+      <w:tr>
+        <w:tc>
+          <w:tcPr>
+            <w:tcW w:type="dxa" w:w="3293"/>
+          </w:tcPr>
+          <w:p>
+            <w:pPr>
+              <w:jc w:val="left"/>
+            </w:pPr>
+            <w:r/>
+            <w:r>
+              <w:rPr>
+                <w:rFonts w:ascii="Arial" w:hAnsi="Arial"/>
+                <w:b/>
+                <w:sz w:val="18"/>
+              </w:rPr>
+              <w:t>模块</w:t>
+            </w:r>
+          </w:p>
+        </w:tc>
+        <w:tc>
+          <w:tcPr>
+            <w:tcW w:type="dxa" w:w="3293"/>
+          </w:tcPr>
+          <w:p>
+            <w:pPr>
+              <w:jc w:val="left"/>
+            </w:pPr>
+            <w:r/>
+            <w:r>
+              <w:rPr>
+                <w:rFonts w:ascii="Arial" w:hAnsi="Arial"/>
+                <w:b/>
+                <w:sz w:val="18"/>
+              </w:rPr>
+              <w:t>已完成优化</w:t>
+            </w:r>
+          </w:p>
+        </w:tc>
+        <w:tc>
+          <w:tcPr>
+            <w:tcW w:type="dxa" w:w="3293"/>
+          </w:tcPr>
+          <w:p>
+            <w:pPr>
+              <w:jc w:val="left"/>
+            </w:pPr>
+            <w:r/>
+            <w:r>
+              <w:rPr>
+                <w:rFonts w:ascii="Arial" w:hAnsi="Arial"/>
+                <w:b/>
+                <w:sz w:val="18"/>
+              </w:rPr>
+              <w:t>后续要求</w:t>
+            </w:r>
+          </w:p>
+        </w:tc>
+      </w:tr>
+      <w:tr>
+        <w:tc>
+          <w:tcPr>
+            <w:tcW w:type="dxa" w:w="3293"/>
+          </w:tcPr>
+          <w:p>
+            <w:pPr>
+              <w:jc w:val="left"/>
+            </w:pPr>
+            <w:r/>
+            <w:r>
+              <w:rPr>
+                <w:rFonts w:ascii="Arial" w:hAnsi="Arial"/>
+                <w:b w:val="0"/>
+                <w:sz w:val="18"/>
+              </w:rPr>
+              <w:t>首页</w:t>
+            </w:r>
+          </w:p>
+        </w:tc>
+        <w:tc>
+          <w:tcPr>
+            <w:tcW w:type="dxa" w:w="3293"/>
+          </w:tcPr>
+          <w:p>
+            <w:pPr>
+              <w:jc w:val="left"/>
+            </w:pPr>
+            <w:r/>
+            <w:r>
+              <w:rPr>
+                <w:rFonts w:ascii="Arial" w:hAnsi="Arial"/>
+                <w:b w:val="0"/>
+                <w:sz w:val="18"/>
+              </w:rPr>
+              <w:t>焦点比赛、今天看什么、未来赛程、社区热帖、最新资讯。</w:t>
+            </w:r>
+          </w:p>
+        </w:tc>
+        <w:tc>
+          <w:tcPr>
+            <w:tcW w:type="dxa" w:w="3293"/>
+          </w:tcPr>
+          <w:p>
+            <w:pPr>
+              <w:jc w:val="left"/>
+            </w:pPr>
+            <w:r/>
+            <w:r>
+              <w:rPr>
+                <w:rFonts w:ascii="Arial" w:hAnsi="Arial"/>
+                <w:b w:val="0"/>
+                <w:sz w:val="18"/>
+              </w:rPr>
+              <w:t>后续按关注联赛/球队做个性化排序。</w:t>
+            </w:r>
+          </w:p>
+        </w:tc>
+      </w:tr>
+      <w:tr>
+        <w:tc>
+          <w:tcPr>
+            <w:tcW w:type="dxa" w:w="3293"/>
+          </w:tcPr>
+          <w:p>
+            <w:pPr>
+              <w:jc w:val="left"/>
+            </w:pPr>
+            <w:r/>
+            <w:r>
+              <w:rPr>
+                <w:rFonts w:ascii="Arial" w:hAnsi="Arial"/>
+                <w:b w:val="0"/>
+                <w:sz w:val="18"/>
+              </w:rPr>
+              <w:t>赛事</w:t>
+            </w:r>
+          </w:p>
+        </w:tc>
+        <w:tc>
+          <w:tcPr>
+            <w:tcW w:type="dxa" w:w="3293"/>
+          </w:tcPr>
+          <w:p>
+            <w:pPr>
+              <w:jc w:val="left"/>
+            </w:pPr>
+            <w:r/>
+            <w:r>
+              <w:rPr>
+                <w:rFonts w:ascii="Arial" w:hAnsi="Arial"/>
+                <w:b w:val="0"/>
+                <w:sz w:val="18"/>
+              </w:rPr>
+              <w:t>联赛说明、今日/明日/14天筛选，比赛卡进入详情。</w:t>
+            </w:r>
+          </w:p>
+        </w:tc>
+        <w:tc>
+          <w:tcPr>
+            <w:tcW w:type="dxa" w:w="3293"/>
+          </w:tcPr>
+          <w:p>
+            <w:pPr>
+              <w:jc w:val="left"/>
+            </w:pPr>
+            <w:r/>
+            <w:r>
+              <w:rPr>
+                <w:rFonts w:ascii="Arial" w:hAnsi="Arial"/>
+                <w:b w:val="0"/>
+                <w:sz w:val="18"/>
+              </w:rPr>
+              <w:t>结构化赛程仍需官方数据或人工维护源。</w:t>
+            </w:r>
+          </w:p>
+        </w:tc>
+      </w:tr>
+      <w:tr>
+        <w:tc>
+          <w:tcPr>
+            <w:tcW w:type="dxa" w:w="3293"/>
+          </w:tcPr>
+          <w:p>
+            <w:pPr>
+              <w:jc w:val="left"/>
+            </w:pPr>
+            <w:r/>
+            <w:r>
+              <w:rPr>
+                <w:rFonts w:ascii="Arial" w:hAnsi="Arial"/>
+                <w:b w:val="0"/>
+                <w:sz w:val="18"/>
+              </w:rPr>
+              <w:t>比赛详情</w:t>
+            </w:r>
+          </w:p>
+        </w:tc>
+        <w:tc>
+          <w:tcPr>
+            <w:tcW w:type="dxa" w:w="3293"/>
+          </w:tcPr>
+          <w:p>
+            <w:pPr>
+              <w:jc w:val="left"/>
+            </w:pPr>
+            <w:r/>
+            <w:r>
+              <w:rPr>
+                <w:rFonts w:ascii="Arial" w:hAnsi="Arial"/>
+                <w:b w:val="0"/>
+                <w:sz w:val="18"/>
+              </w:rPr>
+              <w:t>比赛事实、球队摘要、预约入场、关注比赛、参与讨论。</w:t>
+            </w:r>
+          </w:p>
+        </w:tc>
+        <w:tc>
+          <w:tcPr>
+            <w:tcW w:type="dxa" w:w="3293"/>
+          </w:tcPr>
+          <w:p>
+            <w:pPr>
+              <w:jc w:val="left"/>
+            </w:pPr>
+            <w:r/>
+            <w:r>
+              <w:rPr>
+                <w:rFonts w:ascii="Arial" w:hAnsi="Arial"/>
+                <w:b w:val="0"/>
+                <w:sz w:val="18"/>
+              </w:rPr>
+              <w:t>生产版接入实时比分、事件流、阵容与数据员后台。</w:t>
+            </w:r>
+          </w:p>
+        </w:tc>
+      </w:tr>
+      <w:tr>
+        <w:tc>
+          <w:tcPr>
+            <w:tcW w:type="dxa" w:w="3293"/>
+          </w:tcPr>
+          <w:p>
+            <w:pPr>
+              <w:jc w:val="left"/>
+            </w:pPr>
+            <w:r/>
+            <w:r>
+              <w:rPr>
+                <w:rFonts w:ascii="Arial" w:hAnsi="Arial"/>
+                <w:b w:val="0"/>
+                <w:sz w:val="18"/>
+              </w:rPr>
+              <w:t>资讯详情</w:t>
+            </w:r>
+          </w:p>
+        </w:tc>
+        <w:tc>
+          <w:tcPr>
+            <w:tcW w:type="dxa" w:w="3293"/>
+          </w:tcPr>
+          <w:p>
+            <w:pPr>
+              <w:jc w:val="left"/>
+            </w:pPr>
+            <w:r/>
+            <w:r>
+              <w:rPr>
+                <w:rFonts w:ascii="Arial" w:hAnsi="Arial"/>
+                <w:b w:val="0"/>
+                <w:sz w:val="18"/>
+              </w:rPr>
+              <w:t>展示图片、来源、时间、正文摘要/正文、互动区。</w:t>
+            </w:r>
+          </w:p>
+        </w:tc>
+        <w:tc>
+          <w:tcPr>
+            <w:tcW w:type="dxa" w:w="3293"/>
+          </w:tcPr>
+          <w:p>
+            <w:pPr>
+              <w:jc w:val="left"/>
+            </w:pPr>
+            <w:r/>
+            <w:r>
+              <w:rPr>
+                <w:rFonts w:ascii="Arial" w:hAnsi="Arial"/>
+                <w:b w:val="0"/>
+                <w:sz w:val="18"/>
+              </w:rPr>
+              <w:t>持续保留原文链接与来源版权标识。</w:t>
+            </w:r>
+          </w:p>
+        </w:tc>
+      </w:tr>
+      <w:tr>
+        <w:tc>
+          <w:tcPr>
+            <w:tcW w:type="dxa" w:w="3293"/>
+          </w:tcPr>
+          <w:p>
+            <w:pPr>
+              <w:jc w:val="left"/>
+            </w:pPr>
+            <w:r/>
+            <w:r>
+              <w:rPr>
+                <w:rFonts w:ascii="Arial" w:hAnsi="Arial"/>
+                <w:b w:val="0"/>
+                <w:sz w:val="18"/>
+              </w:rPr>
+              <w:t>社区</w:t>
+            </w:r>
+          </w:p>
+        </w:tc>
+        <w:tc>
+          <w:tcPr>
+            <w:tcW w:type="dxa" w:w="3293"/>
+          </w:tcPr>
+          <w:p>
+            <w:pPr>
+              <w:jc w:val="left"/>
+            </w:pPr>
+            <w:r/>
+            <w:r>
+              <w:rPr>
+                <w:rFonts w:ascii="Arial" w:hAnsi="Arial"/>
+                <w:b w:val="0"/>
+                <w:sz w:val="18"/>
+              </w:rPr>
+              <w:t>30 个模拟话题、约 1500 条讨论/回复、点赞评论收藏数据。</w:t>
+            </w:r>
+          </w:p>
+        </w:tc>
+        <w:tc>
+          <w:tcPr>
+            <w:tcW w:type="dxa" w:w="3293"/>
+          </w:tcPr>
+          <w:p>
+            <w:pPr>
+              <w:jc w:val="left"/>
+            </w:pPr>
+            <w:r/>
+            <w:r>
+              <w:rPr>
+                <w:rFonts w:ascii="Arial" w:hAnsi="Arial"/>
+                <w:b w:val="0"/>
+                <w:sz w:val="18"/>
+              </w:rPr>
+              <w:t>上线前接入审核、举报、敏感词和运营精选。</w:t>
+            </w:r>
+          </w:p>
+        </w:tc>
+      </w:tr>
+      <w:tr>
+        <w:tc>
+          <w:tcPr>
+            <w:tcW w:type="dxa" w:w="3293"/>
+          </w:tcPr>
+          <w:p>
+            <w:pPr>
+              <w:jc w:val="left"/>
+            </w:pPr>
+            <w:r/>
+            <w:r>
+              <w:rPr>
+                <w:rFonts w:ascii="Arial" w:hAnsi="Arial"/>
+                <w:b w:val="0"/>
+                <w:sz w:val="18"/>
+              </w:rPr>
+              <w:t>文旅</w:t>
+            </w:r>
+          </w:p>
+        </w:tc>
+        <w:tc>
+          <w:tcPr>
+            <w:tcW w:type="dxa" w:w="3293"/>
+          </w:tcPr>
+          <w:p>
+            <w:pPr>
+              <w:jc w:val="left"/>
+            </w:pPr>
+            <w:r/>
+            <w:r>
+              <w:rPr>
+                <w:rFonts w:ascii="Arial" w:hAnsi="Arial"/>
+                <w:b w:val="0"/>
+                <w:sz w:val="18"/>
+              </w:rPr>
+              <w:t>按未来 14 天比赛匹配村寨/球队卡片。</w:t>
+            </w:r>
+          </w:p>
+        </w:tc>
+        <w:tc>
+          <w:tcPr>
+            <w:tcW w:type="dxa" w:w="3293"/>
+          </w:tcPr>
+          <w:p>
+            <w:pPr>
+              <w:jc w:val="left"/>
+            </w:pPr>
+            <w:r/>
+            <w:r>
+              <w:rPr>
+                <w:rFonts w:ascii="Arial" w:hAnsi="Arial"/>
+                <w:b w:val="0"/>
+                <w:sz w:val="18"/>
+              </w:rPr>
+              <w:t>已抓取村寨资料缓存复用，缺失时再补充。</w:t>
+            </w:r>
+          </w:p>
+        </w:tc>
+      </w:tr>
+      <w:tr>
+        <w:tc>
+          <w:tcPr>
+            <w:tcW w:type="dxa" w:w="3293"/>
+          </w:tcPr>
+          <w:p>
+            <w:pPr>
+              <w:jc w:val="left"/>
+            </w:pPr>
+            <w:r/>
+            <w:r>
+              <w:rPr>
+                <w:rFonts w:ascii="Arial" w:hAnsi="Arial"/>
+                <w:b w:val="0"/>
+                <w:sz w:val="18"/>
+              </w:rPr>
+              <w:t>我的</w:t>
+            </w:r>
+          </w:p>
+        </w:tc>
+        <w:tc>
+          <w:tcPr>
+            <w:tcW w:type="dxa" w:w="3293"/>
+          </w:tcPr>
+          <w:p>
+            <w:pPr>
+              <w:jc w:val="left"/>
+            </w:pPr>
+            <w:r/>
+            <w:r>
+              <w:rPr>
+                <w:rFonts w:ascii="Arial" w:hAnsi="Arial"/>
+                <w:b w:val="0"/>
+                <w:sz w:val="18"/>
+              </w:rPr>
+              <w:t>记录本地互动、关注、评论、点赞、收藏、浏览等行为。</w:t>
+            </w:r>
+          </w:p>
+        </w:tc>
+        <w:tc>
+          <w:tcPr>
+            <w:tcW w:type="dxa" w:w="3293"/>
+          </w:tcPr>
+          <w:p>
+            <w:pPr>
+              <w:jc w:val="left"/>
+            </w:pPr>
+            <w:r/>
+            <w:r>
+              <w:rPr>
+                <w:rFonts w:ascii="Arial" w:hAnsi="Arial"/>
+                <w:b w:val="0"/>
+                <w:sz w:val="18"/>
+              </w:rPr>
+              <w:t>登录后从服务端同步跨设备行为。</w:t>
+            </w:r>
+          </w:p>
+        </w:tc>
+      </w:tr>
+      <w:tr>
+        <w:tc>
+          <w:tcPr>
+            <w:tcW w:type="dxa" w:w="3293"/>
+          </w:tcPr>
+          <w:p>
+            <w:pPr>
+              <w:jc w:val="left"/>
+            </w:pPr>
+            <w:r/>
+            <w:r>
+              <w:rPr>
+                <w:rFonts w:ascii="Arial" w:hAnsi="Arial"/>
+                <w:b w:val="0"/>
+                <w:sz w:val="18"/>
+              </w:rPr>
+              <w:t>顶部沉浸</w:t>
+            </w:r>
+          </w:p>
+        </w:tc>
+        <w:tc>
+          <w:tcPr>
+            <w:tcW w:type="dxa" w:w="3293"/>
+          </w:tcPr>
+          <w:p>
+            <w:pPr>
+              <w:jc w:val="left"/>
+            </w:pPr>
+            <w:r/>
+            <w:r>
+              <w:rPr>
+                <w:rFonts w:ascii="Arial" w:hAnsi="Arial"/>
+                <w:b w:val="0"/>
+                <w:sz w:val="18"/>
+              </w:rPr>
+              <w:t>H5 去掉多余白色顶部状态栏，APK 尽量全屏。</w:t>
+            </w:r>
+          </w:p>
+        </w:tc>
+        <w:tc>
+          <w:tcPr>
+            <w:tcW w:type="dxa" w:w="3293"/>
+          </w:tcPr>
+          <w:p>
+            <w:pPr>
+              <w:jc w:val="left"/>
+            </w:pPr>
+            <w:r/>
+            <w:r>
+              <w:rPr>
+                <w:rFonts w:ascii="Arial" w:hAnsi="Arial"/>
+                <w:b w:val="0"/>
+                <w:sz w:val="18"/>
+              </w:rPr>
+              <w:t>iOS/Android 真机分别做安全区适配。</w:t>
+            </w:r>
+          </w:p>
+        </w:tc>
+      </w:tr>
+    </w:tbl>
+    <w:p/>
+    <w:p>
+      <w:pPr>
+        <w:pStyle w:val="Heading2"/>
+      </w:pPr>
+      <w:r>
+        <w:t>16.3 每日数据更新工作流</w:t>
+      </w:r>
+    </w:p>
+    <w:tbl>
+      <w:tblPr>
+        <w:tblStyle w:val="TableGrid"/>
+        <w:tblW w:type="auto" w:w="0"/>
+        <w:tblLayout w:type="autofit"/>
+        <w:tblLook w:firstColumn="1" w:firstRow="1" w:lastColumn="0" w:lastRow="0" w:noHBand="0" w:noVBand="1" w:val="04A0"/>
+      </w:tblPr>
+      <w:tblGrid>
+        <w:gridCol w:w="2469"/>
+        <w:gridCol w:w="2469"/>
+        <w:gridCol w:w="2469"/>
+        <w:gridCol w:w="2469"/>
+      </w:tblGrid>
+      <w:tr>
+        <w:tc>
+          <w:tcPr>
+            <w:tcW w:type="dxa" w:w="2469"/>
+          </w:tcPr>
+          <w:p>
+            <w:pPr>
+              <w:jc w:val="left"/>
+            </w:pPr>
+            <w:r/>
+            <w:r>
+              <w:rPr>
+                <w:rFonts w:ascii="Arial" w:hAnsi="Arial"/>
+                <w:b/>
+                <w:sz w:val="18"/>
+              </w:rPr>
+              <w:t>数据类型</w:t>
+            </w:r>
+          </w:p>
+        </w:tc>
+        <w:tc>
+          <w:tcPr>
+            <w:tcW w:type="dxa" w:w="2469"/>
+          </w:tcPr>
+          <w:p>
+            <w:pPr>
+              <w:jc w:val="left"/>
+            </w:pPr>
+            <w:r/>
+            <w:r>
+              <w:rPr>
+                <w:rFonts w:ascii="Arial" w:hAnsi="Arial"/>
+                <w:b/>
+                <w:sz w:val="18"/>
+              </w:rPr>
+              <w:t>当前方案</w:t>
+            </w:r>
+          </w:p>
+        </w:tc>
+        <w:tc>
+          <w:tcPr>
+            <w:tcW w:type="dxa" w:w="2469"/>
+          </w:tcPr>
+          <w:p>
+            <w:pPr>
+              <w:jc w:val="left"/>
+            </w:pPr>
+            <w:r/>
+            <w:r>
+              <w:rPr>
+                <w:rFonts w:ascii="Arial" w:hAnsi="Arial"/>
+                <w:b/>
+                <w:sz w:val="18"/>
+              </w:rPr>
+              <w:t>更新频率</w:t>
+            </w:r>
+          </w:p>
+        </w:tc>
+        <w:tc>
+          <w:tcPr>
+            <w:tcW w:type="dxa" w:w="2469"/>
+          </w:tcPr>
+          <w:p>
+            <w:pPr>
+              <w:jc w:val="left"/>
+            </w:pPr>
+            <w:r/>
+            <w:r>
+              <w:rPr>
+                <w:rFonts w:ascii="Arial" w:hAnsi="Arial"/>
+                <w:b/>
+                <w:sz w:val="18"/>
+              </w:rPr>
+              <w:t>产品表现</w:t>
+            </w:r>
+          </w:p>
+        </w:tc>
+      </w:tr>
+      <w:tr>
+        <w:tc>
+          <w:tcPr>
+            <w:tcW w:type="dxa" w:w="2469"/>
+          </w:tcPr>
+          <w:p>
+            <w:pPr>
+              <w:jc w:val="left"/>
+            </w:pPr>
+            <w:r/>
+            <w:r>
+              <w:rPr>
+                <w:rFonts w:ascii="Arial" w:hAnsi="Arial"/>
+                <w:b w:val="0"/>
+                <w:sz w:val="18"/>
+              </w:rPr>
+              <w:t>新闻资讯</w:t>
+            </w:r>
+          </w:p>
+        </w:tc>
+        <w:tc>
+          <w:tcPr>
+            <w:tcW w:type="dxa" w:w="2469"/>
+          </w:tcPr>
+          <w:p>
+            <w:pPr>
+              <w:jc w:val="left"/>
+            </w:pPr>
+            <w:r/>
+            <w:r>
+              <w:rPr>
+                <w:rFonts w:ascii="Arial" w:hAnsi="Arial"/>
+                <w:b w:val="0"/>
+                <w:sz w:val="18"/>
+              </w:rPr>
+              <w:t>从官方、政府专题、权威媒体等公开来源抓取，生成静态 bootstrap.json。</w:t>
+            </w:r>
+          </w:p>
+        </w:tc>
+        <w:tc>
+          <w:tcPr>
+            <w:tcW w:type="dxa" w:w="2469"/>
+          </w:tcPr>
+          <w:p>
+            <w:pPr>
+              <w:jc w:val="left"/>
+            </w:pPr>
+            <w:r/>
+            <w:r>
+              <w:rPr>
+                <w:rFonts w:ascii="Arial" w:hAnsi="Arial"/>
+                <w:b w:val="0"/>
+                <w:sz w:val="18"/>
+              </w:rPr>
+              <w:t>每天北京时间 08:30</w:t>
+            </w:r>
+          </w:p>
+        </w:tc>
+        <w:tc>
+          <w:tcPr>
+            <w:tcW w:type="dxa" w:w="2469"/>
+          </w:tcPr>
+          <w:p>
+            <w:pPr>
+              <w:jc w:val="left"/>
+            </w:pPr>
+            <w:r/>
+            <w:r>
+              <w:rPr>
+                <w:rFonts w:ascii="Arial" w:hAnsi="Arial"/>
+                <w:b w:val="0"/>
+                <w:sz w:val="18"/>
+              </w:rPr>
+              <w:t>新资讯排在前面，旧资讯长期保留。</w:t>
+            </w:r>
+          </w:p>
+        </w:tc>
+      </w:tr>
+      <w:tr>
+        <w:tc>
+          <w:tcPr>
+            <w:tcW w:type="dxa" w:w="2469"/>
+          </w:tcPr>
+          <w:p>
+            <w:pPr>
+              <w:jc w:val="left"/>
+            </w:pPr>
+            <w:r/>
+            <w:r>
+              <w:rPr>
+                <w:rFonts w:ascii="Arial" w:hAnsi="Arial"/>
+                <w:b w:val="0"/>
+                <w:sz w:val="18"/>
+              </w:rPr>
+              <w:t>资讯图片/正文</w:t>
+            </w:r>
+          </w:p>
+        </w:tc>
+        <w:tc>
+          <w:tcPr>
+            <w:tcW w:type="dxa" w:w="2469"/>
+          </w:tcPr>
+          <w:p>
+            <w:pPr>
+              <w:jc w:val="left"/>
+            </w:pPr>
+            <w:r/>
+            <w:r>
+              <w:rPr>
+                <w:rFonts w:ascii="Arial" w:hAnsi="Arial"/>
+                <w:b w:val="0"/>
+                <w:sz w:val="18"/>
+              </w:rPr>
+              <w:t>详情页尽量保存图片、正文摘要/正文与来源信息。</w:t>
+            </w:r>
+          </w:p>
+        </w:tc>
+        <w:tc>
+          <w:tcPr>
+            <w:tcW w:type="dxa" w:w="2469"/>
+          </w:tcPr>
+          <w:p>
+            <w:pPr>
+              <w:jc w:val="left"/>
+            </w:pPr>
+            <w:r/>
+            <w:r>
+              <w:rPr>
+                <w:rFonts w:ascii="Arial" w:hAnsi="Arial"/>
+                <w:b w:val="0"/>
+                <w:sz w:val="18"/>
+              </w:rPr>
+              <w:t>随每日任务更新</w:t>
+            </w:r>
+          </w:p>
+        </w:tc>
+        <w:tc>
+          <w:tcPr>
+            <w:tcW w:type="dxa" w:w="2469"/>
+          </w:tcPr>
+          <w:p>
+            <w:pPr>
+              <w:jc w:val="left"/>
+            </w:pPr>
+            <w:r/>
+            <w:r>
+              <w:rPr>
+                <w:rFonts w:ascii="Arial" w:hAnsi="Arial"/>
+                <w:b w:val="0"/>
+                <w:sz w:val="18"/>
+              </w:rPr>
+              <w:t>用户可在站内完成基本阅读，再跳转原文核验。</w:t>
+            </w:r>
+          </w:p>
+        </w:tc>
+      </w:tr>
+      <w:tr>
+        <w:tc>
+          <w:tcPr>
+            <w:tcW w:type="dxa" w:w="2469"/>
+          </w:tcPr>
+          <w:p>
+            <w:pPr>
+              <w:jc w:val="left"/>
+            </w:pPr>
+            <w:r/>
+            <w:r>
+              <w:rPr>
+                <w:rFonts w:ascii="Arial" w:hAnsi="Arial"/>
+                <w:b w:val="0"/>
+                <w:sz w:val="18"/>
+              </w:rPr>
+              <w:t>未来赛程</w:t>
+            </w:r>
+          </w:p>
+        </w:tc>
+        <w:tc>
+          <w:tcPr>
+            <w:tcW w:type="dxa" w:w="2469"/>
+          </w:tcPr>
+          <w:p>
+            <w:pPr>
+              <w:jc w:val="left"/>
+            </w:pPr>
+            <w:r/>
+            <w:r>
+              <w:rPr>
+                <w:rFonts w:ascii="Arial" w:hAnsi="Arial"/>
+                <w:b w:val="0"/>
+                <w:sz w:val="18"/>
+              </w:rPr>
+              <w:t>合并公开赛程文章与 data/manual/matches.json 的结构化比赛。</w:t>
+            </w:r>
+          </w:p>
+        </w:tc>
+        <w:tc>
+          <w:tcPr>
+            <w:tcW w:type="dxa" w:w="2469"/>
+          </w:tcPr>
+          <w:p>
+            <w:pPr>
+              <w:jc w:val="left"/>
+            </w:pPr>
+            <w:r/>
+            <w:r>
+              <w:rPr>
+                <w:rFonts w:ascii="Arial" w:hAnsi="Arial"/>
+                <w:b w:val="0"/>
+                <w:sz w:val="18"/>
+              </w:rPr>
+              <w:t>与资讯每日任务一起更新</w:t>
+            </w:r>
+          </w:p>
+        </w:tc>
+        <w:tc>
+          <w:tcPr>
+            <w:tcW w:type="dxa" w:w="2469"/>
+          </w:tcPr>
+          <w:p>
+            <w:pPr>
+              <w:jc w:val="left"/>
+            </w:pPr>
+            <w:r/>
+            <w:r>
+              <w:rPr>
+                <w:rFonts w:ascii="Arial" w:hAnsi="Arial"/>
+                <w:b w:val="0"/>
+                <w:sz w:val="18"/>
+              </w:rPr>
+              <w:t>赛事页展示未来 14 天对战球队、时间、地点，未开赛不显示比分。</w:t>
+            </w:r>
+          </w:p>
+        </w:tc>
+      </w:tr>
+      <w:tr>
+        <w:tc>
+          <w:tcPr>
+            <w:tcW w:type="dxa" w:w="2469"/>
+          </w:tcPr>
+          <w:p>
+            <w:pPr>
+              <w:jc w:val="left"/>
+            </w:pPr>
+            <w:r/>
+            <w:r>
+              <w:rPr>
+                <w:rFonts w:ascii="Arial" w:hAnsi="Arial"/>
+                <w:b w:val="0"/>
+                <w:sz w:val="18"/>
+              </w:rPr>
+              <w:t>文旅卡片</w:t>
+            </w:r>
+          </w:p>
+        </w:tc>
+        <w:tc>
+          <w:tcPr>
+            <w:tcW w:type="dxa" w:w="2469"/>
+          </w:tcPr>
+          <w:p>
+            <w:pPr>
+              <w:jc w:val="left"/>
+            </w:pPr>
+            <w:r/>
+            <w:r>
+              <w:rPr>
+                <w:rFonts w:ascii="Arial" w:hAnsi="Arial"/>
+                <w:b w:val="0"/>
+                <w:sz w:val="18"/>
+              </w:rPr>
+              <w:t>根据未来 14 天比赛匹配村寨、球队、场地和攻略。</w:t>
+            </w:r>
+          </w:p>
+        </w:tc>
+        <w:tc>
+          <w:tcPr>
+            <w:tcW w:type="dxa" w:w="2469"/>
+          </w:tcPr>
+          <w:p>
+            <w:pPr>
+              <w:jc w:val="left"/>
+            </w:pPr>
+            <w:r/>
+            <w:r>
+              <w:rPr>
+                <w:rFonts w:ascii="Arial" w:hAnsi="Arial"/>
+                <w:b w:val="0"/>
+                <w:sz w:val="18"/>
+              </w:rPr>
+              <w:t>每次赛事数据更新后检查</w:t>
+            </w:r>
+          </w:p>
+        </w:tc>
+        <w:tc>
+          <w:tcPr>
+            <w:tcW w:type="dxa" w:w="2469"/>
+          </w:tcPr>
+          <w:p>
+            <w:pPr>
+              <w:jc w:val="left"/>
+            </w:pPr>
+            <w:r/>
+            <w:r>
+              <w:rPr>
+                <w:rFonts w:ascii="Arial" w:hAnsi="Arial"/>
+                <w:b w:val="0"/>
+                <w:sz w:val="18"/>
+              </w:rPr>
+              <w:t>村寨资料已入库则复用，缺失时再补充。</w:t>
+            </w:r>
+          </w:p>
+        </w:tc>
+      </w:tr>
+      <w:tr>
+        <w:tc>
+          <w:tcPr>
+            <w:tcW w:type="dxa" w:w="2469"/>
+          </w:tcPr>
+          <w:p>
+            <w:pPr>
+              <w:jc w:val="left"/>
+            </w:pPr>
+            <w:r/>
+            <w:r>
+              <w:rPr>
+                <w:rFonts w:ascii="Arial" w:hAnsi="Arial"/>
+                <w:b w:val="0"/>
+                <w:sz w:val="18"/>
+              </w:rPr>
+              <w:t>村寨图片</w:t>
+            </w:r>
+          </w:p>
+        </w:tc>
+        <w:tc>
+          <w:tcPr>
+            <w:tcW w:type="dxa" w:w="2469"/>
+          </w:tcPr>
+          <w:p>
+            <w:pPr>
+              <w:jc w:val="left"/>
+            </w:pPr>
+            <w:r/>
+            <w:r>
+              <w:rPr>
+                <w:rFonts w:ascii="Arial" w:hAnsi="Arial"/>
+                <w:b w:val="0"/>
+                <w:sz w:val="18"/>
+              </w:rPr>
+              <w:t>为每个村寨查找更相关的村寨/目的地图片。</w:t>
+            </w:r>
+          </w:p>
+        </w:tc>
+        <w:tc>
+          <w:tcPr>
+            <w:tcW w:type="dxa" w:w="2469"/>
+          </w:tcPr>
+          <w:p>
+            <w:pPr>
+              <w:jc w:val="left"/>
+            </w:pPr>
+            <w:r/>
+            <w:r>
+              <w:rPr>
+                <w:rFonts w:ascii="Arial" w:hAnsi="Arial"/>
+                <w:b w:val="0"/>
+                <w:sz w:val="18"/>
+              </w:rPr>
+              <w:t>文旅资料新增时执行</w:t>
+            </w:r>
+          </w:p>
+        </w:tc>
+        <w:tc>
+          <w:tcPr>
+            <w:tcW w:type="dxa" w:w="2469"/>
+          </w:tcPr>
+          <w:p>
+            <w:pPr>
+              <w:jc w:val="left"/>
+            </w:pPr>
+            <w:r/>
+            <w:r>
+              <w:rPr>
+                <w:rFonts w:ascii="Arial" w:hAnsi="Arial"/>
+                <w:b w:val="0"/>
+                <w:sz w:val="18"/>
+              </w:rPr>
+              <w:t>避免使用与村寨不相关的随机图片。</w:t>
+            </w:r>
+          </w:p>
+        </w:tc>
+      </w:tr>
+      <w:tr>
+        <w:tc>
+          <w:tcPr>
+            <w:tcW w:type="dxa" w:w="2469"/>
+          </w:tcPr>
+          <w:p>
+            <w:pPr>
+              <w:jc w:val="left"/>
+            </w:pPr>
+            <w:r/>
+            <w:r>
+              <w:rPr>
+                <w:rFonts w:ascii="Arial" w:hAnsi="Arial"/>
+                <w:b w:val="0"/>
+                <w:sz w:val="18"/>
+              </w:rPr>
+              <w:t>社区头像</w:t>
+            </w:r>
+          </w:p>
+        </w:tc>
+        <w:tc>
+          <w:tcPr>
+            <w:tcW w:type="dxa" w:w="2469"/>
+          </w:tcPr>
+          <w:p>
+            <w:pPr>
+              <w:jc w:val="left"/>
+            </w:pPr>
+            <w:r/>
+            <w:r>
+              <w:rPr>
+                <w:rFonts w:ascii="Arial" w:hAnsi="Arial"/>
+                <w:b w:val="0"/>
+                <w:sz w:val="18"/>
+              </w:rPr>
+              <w:t>约 50 张随机头像池，模拟用户评论时随机分配。</w:t>
+            </w:r>
+          </w:p>
+        </w:tc>
+        <w:tc>
+          <w:tcPr>
+            <w:tcW w:type="dxa" w:w="2469"/>
+          </w:tcPr>
+          <w:p>
+            <w:pPr>
+              <w:jc w:val="left"/>
+            </w:pPr>
+            <w:r/>
+            <w:r>
+              <w:rPr>
+                <w:rFonts w:ascii="Arial" w:hAnsi="Arial"/>
+                <w:b w:val="0"/>
+                <w:sz w:val="18"/>
+              </w:rPr>
+              <w:t>新增模拟内容时执行</w:t>
+            </w:r>
+          </w:p>
+        </w:tc>
+        <w:tc>
+          <w:tcPr>
+            <w:tcW w:type="dxa" w:w="2469"/>
+          </w:tcPr>
+          <w:p>
+            <w:pPr>
+              <w:jc w:val="left"/>
+            </w:pPr>
+            <w:r/>
+            <w:r>
+              <w:rPr>
+                <w:rFonts w:ascii="Arial" w:hAnsi="Arial"/>
+                <w:b w:val="0"/>
+                <w:sz w:val="18"/>
+              </w:rPr>
+              <w:t>保留评论数量，同时提高讨论真实感。</w:t>
+            </w:r>
+          </w:p>
+        </w:tc>
+      </w:tr>
+    </w:tbl>
+    <w:p/>
+    <w:p>
+      <w:r>
+        <w:t>自动化发布链路：每日任务生成 apps/web/public/data/bootstrap.json，构建并验证前端；若数据有变化，自动提交 Update public data，再部署到 Vercel Production。用户打开 H5/APK 时会读取最新静态数据。</w:t>
+      </w:r>
+    </w:p>
+    <w:p>
+      <w:pPr>
+        <w:pStyle w:val="Heading2"/>
+      </w:pPr>
+      <w:r>
+        <w:t>16.4 账号体系与真实登录</w:t>
+      </w:r>
+    </w:p>
+    <w:tbl>
+      <w:tblPr>
+        <w:tblStyle w:val="TableGrid"/>
+        <w:tblW w:type="auto" w:w="0"/>
+        <w:tblLayout w:type="autofit"/>
+        <w:tblLook w:firstColumn="1" w:firstRow="1" w:lastColumn="0" w:lastRow="0" w:noHBand="0" w:noVBand="1" w:val="04A0"/>
+      </w:tblPr>
+      <w:tblGrid>
+        <w:gridCol w:w="3293"/>
+        <w:gridCol w:w="3293"/>
+        <w:gridCol w:w="3293"/>
+      </w:tblGrid>
+      <w:tr>
+        <w:tc>
+          <w:tcPr>
+            <w:tcW w:type="dxa" w:w="3293"/>
+          </w:tcPr>
+          <w:p>
+            <w:pPr>
+              <w:jc w:val="left"/>
+            </w:pPr>
+            <w:r/>
+            <w:r>
+              <w:rPr>
+                <w:rFonts w:ascii="Arial" w:hAnsi="Arial"/>
+                <w:b/>
+                <w:sz w:val="18"/>
+              </w:rPr>
+              <w:t>能力</w:t>
+            </w:r>
+          </w:p>
+        </w:tc>
+        <w:tc>
+          <w:tcPr>
+            <w:tcW w:type="dxa" w:w="3293"/>
+          </w:tcPr>
+          <w:p>
+            <w:pPr>
+              <w:jc w:val="left"/>
+            </w:pPr>
+            <w:r/>
+            <w:r>
+              <w:rPr>
+                <w:rFonts w:ascii="Arial" w:hAnsi="Arial"/>
+                <w:b/>
+                <w:sz w:val="18"/>
+              </w:rPr>
+              <w:t>当前接口/实现</w:t>
+            </w:r>
+          </w:p>
+        </w:tc>
+        <w:tc>
+          <w:tcPr>
+            <w:tcW w:type="dxa" w:w="3293"/>
+          </w:tcPr>
+          <w:p>
+            <w:pPr>
+              <w:jc w:val="left"/>
+            </w:pPr>
+            <w:r/>
+            <w:r>
+              <w:rPr>
+                <w:rFonts w:ascii="Arial" w:hAnsi="Arial"/>
+                <w:b/>
+                <w:sz w:val="18"/>
+              </w:rPr>
+              <w:t>说明</w:t>
+            </w:r>
+          </w:p>
+        </w:tc>
+      </w:tr>
+      <w:tr>
+        <w:tc>
+          <w:tcPr>
+            <w:tcW w:type="dxa" w:w="3293"/>
+          </w:tcPr>
+          <w:p>
+            <w:pPr>
+              <w:jc w:val="left"/>
+            </w:pPr>
+            <w:r/>
+            <w:r>
+              <w:rPr>
+                <w:rFonts w:ascii="Arial" w:hAnsi="Arial"/>
+                <w:b w:val="0"/>
+                <w:sz w:val="18"/>
+              </w:rPr>
+              <w:t>手机验证码发送</w:t>
+            </w:r>
+          </w:p>
+        </w:tc>
+        <w:tc>
+          <w:tcPr>
+            <w:tcW w:type="dxa" w:w="3293"/>
+          </w:tcPr>
+          <w:p>
+            <w:pPr>
+              <w:jc w:val="left"/>
+            </w:pPr>
+            <w:r/>
+            <w:r>
+              <w:rPr>
+                <w:rFonts w:ascii="Arial" w:hAnsi="Arial"/>
+                <w:b w:val="0"/>
+                <w:sz w:val="18"/>
+              </w:rPr>
+              <w:t>POST /api/auth/phone/code</w:t>
+            </w:r>
+          </w:p>
+        </w:tc>
+        <w:tc>
+          <w:tcPr>
+            <w:tcW w:type="dxa" w:w="3293"/>
+          </w:tcPr>
+          <w:p>
+            <w:pPr>
+              <w:jc w:val="left"/>
+            </w:pPr>
+            <w:r/>
+            <w:r>
+              <w:rPr>
+                <w:rFonts w:ascii="Arial" w:hAnsi="Arial"/>
+                <w:b w:val="0"/>
+                <w:sz w:val="18"/>
+              </w:rPr>
+              <w:t>使用腾讯云短信 SendSms，不再使用固定验证码或本地伪登录。</w:t>
+            </w:r>
+          </w:p>
+        </w:tc>
+      </w:tr>
+      <w:tr>
+        <w:tc>
+          <w:tcPr>
+            <w:tcW w:type="dxa" w:w="3293"/>
+          </w:tcPr>
+          <w:p>
+            <w:pPr>
+              <w:jc w:val="left"/>
+            </w:pPr>
+            <w:r/>
+            <w:r>
+              <w:rPr>
+                <w:rFonts w:ascii="Arial" w:hAnsi="Arial"/>
+                <w:b w:val="0"/>
+                <w:sz w:val="18"/>
+              </w:rPr>
+              <w:t>手机验证码登录</w:t>
+            </w:r>
+          </w:p>
+        </w:tc>
+        <w:tc>
+          <w:tcPr>
+            <w:tcW w:type="dxa" w:w="3293"/>
+          </w:tcPr>
+          <w:p>
+            <w:pPr>
+              <w:jc w:val="left"/>
+            </w:pPr>
+            <w:r/>
+            <w:r>
+              <w:rPr>
+                <w:rFonts w:ascii="Arial" w:hAnsi="Arial"/>
+                <w:b w:val="0"/>
+                <w:sz w:val="18"/>
+              </w:rPr>
+              <w:t>POST /api/auth/phone/login</w:t>
+            </w:r>
+          </w:p>
+        </w:tc>
+        <w:tc>
+          <w:tcPr>
+            <w:tcW w:type="dxa" w:w="3293"/>
+          </w:tcPr>
+          <w:p>
+            <w:pPr>
+              <w:jc w:val="left"/>
+            </w:pPr>
+            <w:r/>
+            <w:r>
+              <w:rPr>
+                <w:rFonts w:ascii="Arial" w:hAnsi="Arial"/>
+                <w:b w:val="0"/>
+                <w:sz w:val="18"/>
+              </w:rPr>
+              <w:t>校验验证码后返回 AuthSession。</w:t>
+            </w:r>
+          </w:p>
+        </w:tc>
+      </w:tr>
+      <w:tr>
+        <w:tc>
+          <w:tcPr>
+            <w:tcW w:type="dxa" w:w="3293"/>
+          </w:tcPr>
+          <w:p>
+            <w:pPr>
+              <w:jc w:val="left"/>
+            </w:pPr>
+            <w:r/>
+            <w:r>
+              <w:rPr>
+                <w:rFonts w:ascii="Arial" w:hAnsi="Arial"/>
+                <w:b w:val="0"/>
+                <w:sz w:val="18"/>
+              </w:rPr>
+              <w:t>微信登录</w:t>
+            </w:r>
+          </w:p>
+        </w:tc>
+        <w:tc>
+          <w:tcPr>
+            <w:tcW w:type="dxa" w:w="3293"/>
+          </w:tcPr>
+          <w:p>
+            <w:pPr>
+              <w:jc w:val="left"/>
+            </w:pPr>
+            <w:r/>
+            <w:r>
+              <w:rPr>
+                <w:rFonts w:ascii="Arial" w:hAnsi="Arial"/>
+                <w:b w:val="0"/>
+                <w:sz w:val="18"/>
+              </w:rPr>
+              <w:t>POST /api/auth/wechat/login</w:t>
+            </w:r>
+          </w:p>
+        </w:tc>
+        <w:tc>
+          <w:tcPr>
+            <w:tcW w:type="dxa" w:w="3293"/>
+          </w:tcPr>
+          <w:p>
+            <w:pPr>
+              <w:jc w:val="left"/>
+            </w:pPr>
+            <w:r/>
+            <w:r>
+              <w:rPr>
+                <w:rFonts w:ascii="Arial" w:hAnsi="Arial"/>
+                <w:b w:val="0"/>
+                <w:sz w:val="18"/>
+              </w:rPr>
+              <w:t>小程序环境通过 wx.login 获取 code，后端调用微信 jscode2session 换取 openid。</w:t>
+            </w:r>
+          </w:p>
+        </w:tc>
+      </w:tr>
+      <w:tr>
+        <w:tc>
+          <w:tcPr>
+            <w:tcW w:type="dxa" w:w="3293"/>
+          </w:tcPr>
+          <w:p>
+            <w:pPr>
+              <w:jc w:val="left"/>
+            </w:pPr>
+            <w:r/>
+            <w:r>
+              <w:rPr>
+                <w:rFonts w:ascii="Arial" w:hAnsi="Arial"/>
+                <w:b w:val="0"/>
+                <w:sz w:val="18"/>
+              </w:rPr>
+              <w:t>当前用户</w:t>
+            </w:r>
+          </w:p>
+        </w:tc>
+        <w:tc>
+          <w:tcPr>
+            <w:tcW w:type="dxa" w:w="3293"/>
+          </w:tcPr>
+          <w:p>
+            <w:pPr>
+              <w:jc w:val="left"/>
+            </w:pPr>
+            <w:r/>
+            <w:r>
+              <w:rPr>
+                <w:rFonts w:ascii="Arial" w:hAnsi="Arial"/>
+                <w:b w:val="0"/>
+                <w:sz w:val="18"/>
+              </w:rPr>
+              <w:t>GET /api/auth/me</w:t>
+            </w:r>
+          </w:p>
+        </w:tc>
+        <w:tc>
+          <w:tcPr>
+            <w:tcW w:type="dxa" w:w="3293"/>
+          </w:tcPr>
+          <w:p>
+            <w:pPr>
+              <w:jc w:val="left"/>
+            </w:pPr>
+            <w:r/>
+            <w:r>
+              <w:rPr>
+                <w:rFonts w:ascii="Arial" w:hAnsi="Arial"/>
+                <w:b w:val="0"/>
+                <w:sz w:val="18"/>
+              </w:rPr>
+              <w:t>通过 Authorization: Bearer &lt;token&gt; 获取当前登录用户。</w:t>
+            </w:r>
+          </w:p>
+        </w:tc>
+      </w:tr>
+      <w:tr>
+        <w:tc>
+          <w:tcPr>
+            <w:tcW w:type="dxa" w:w="3293"/>
+          </w:tcPr>
+          <w:p>
+            <w:pPr>
+              <w:jc w:val="left"/>
+            </w:pPr>
+            <w:r/>
+            <w:r>
+              <w:rPr>
+                <w:rFonts w:ascii="Arial" w:hAnsi="Arial"/>
+                <w:b w:val="0"/>
+                <w:sz w:val="18"/>
+              </w:rPr>
+              <w:t>退出登录</w:t>
+            </w:r>
+          </w:p>
+        </w:tc>
+        <w:tc>
+          <w:tcPr>
+            <w:tcW w:type="dxa" w:w="3293"/>
+          </w:tcPr>
+          <w:p>
+            <w:pPr>
+              <w:jc w:val="left"/>
+            </w:pPr>
+            <w:r/>
+            <w:r>
+              <w:rPr>
+                <w:rFonts w:ascii="Arial" w:hAnsi="Arial"/>
+                <w:b w:val="0"/>
+                <w:sz w:val="18"/>
+              </w:rPr>
+              <w:t>POST /api/auth/logout</w:t>
+            </w:r>
+          </w:p>
+        </w:tc>
+        <w:tc>
+          <w:tcPr>
+            <w:tcW w:type="dxa" w:w="3293"/>
+          </w:tcPr>
+          <w:p>
+            <w:pPr>
+              <w:jc w:val="left"/>
+            </w:pPr>
+            <w:r/>
+            <w:r>
+              <w:rPr>
+                <w:rFonts w:ascii="Arial" w:hAnsi="Arial"/>
+                <w:b w:val="0"/>
+                <w:sz w:val="18"/>
+              </w:rPr>
+              <w:t>清理当前 session。</w:t>
+            </w:r>
+          </w:p>
+        </w:tc>
+      </w:tr>
+      <w:tr>
+        <w:tc>
+          <w:tcPr>
+            <w:tcW w:type="dxa" w:w="3293"/>
+          </w:tcPr>
+          <w:p>
+            <w:pPr>
+              <w:jc w:val="left"/>
+            </w:pPr>
+            <w:r/>
+            <w:r>
+              <w:rPr>
+                <w:rFonts w:ascii="Arial" w:hAnsi="Arial"/>
+                <w:b w:val="0"/>
+                <w:sz w:val="18"/>
+              </w:rPr>
+              <w:t>前端触发点</w:t>
+            </w:r>
+          </w:p>
+        </w:tc>
+        <w:tc>
+          <w:tcPr>
+            <w:tcW w:type="dxa" w:w="3293"/>
+          </w:tcPr>
+          <w:p>
+            <w:pPr>
+              <w:jc w:val="left"/>
+            </w:pPr>
+            <w:r/>
+            <w:r>
+              <w:rPr>
+                <w:rFonts w:ascii="Arial" w:hAnsi="Arial"/>
+                <w:b w:val="0"/>
+                <w:sz w:val="18"/>
+              </w:rPr>
+              <w:t>评论、回复、收藏、关注、预约入场</w:t>
+            </w:r>
+          </w:p>
+        </w:tc>
+        <w:tc>
+          <w:tcPr>
+            <w:tcW w:type="dxa" w:w="3293"/>
+          </w:tcPr>
+          <w:p>
+            <w:pPr>
+              <w:jc w:val="left"/>
+            </w:pPr>
+            <w:r/>
+            <w:r>
+              <w:rPr>
+                <w:rFonts w:ascii="Arial" w:hAnsi="Arial"/>
+                <w:b w:val="0"/>
+                <w:sz w:val="18"/>
+              </w:rPr>
+              <w:t>未登录时拉起登录弹层。</w:t>
+            </w:r>
+          </w:p>
+        </w:tc>
+      </w:tr>
+    </w:tbl>
+    <w:p/>
+    <w:tbl>
+      <w:tblPr>
+        <w:tblStyle w:val="TableGrid"/>
+        <w:tblW w:type="auto" w:w="0"/>
+        <w:tblLayout w:type="autofit"/>
+        <w:tblLook w:firstColumn="1" w:firstRow="1" w:lastColumn="0" w:lastRow="0" w:noHBand="0" w:noVBand="1" w:val="04A0"/>
+      </w:tblPr>
+      <w:tblGrid>
+        <w:gridCol w:w="3293"/>
+        <w:gridCol w:w="3293"/>
+        <w:gridCol w:w="3293"/>
+      </w:tblGrid>
+      <w:tr>
+        <w:tc>
+          <w:tcPr>
+            <w:tcW w:type="dxa" w:w="3293"/>
+          </w:tcPr>
+          <w:p>
+            <w:pPr>
+              <w:jc w:val="left"/>
+            </w:pPr>
+            <w:r/>
+            <w:r>
+              <w:rPr>
+                <w:rFonts w:ascii="Arial" w:hAnsi="Arial"/>
+                <w:b/>
+                <w:sz w:val="18"/>
+              </w:rPr>
+              <w:t>类型</w:t>
+            </w:r>
+          </w:p>
+        </w:tc>
+        <w:tc>
+          <w:tcPr>
+            <w:tcW w:type="dxa" w:w="3293"/>
+          </w:tcPr>
+          <w:p>
+            <w:pPr>
+              <w:jc w:val="left"/>
+            </w:pPr>
+            <w:r/>
+            <w:r>
+              <w:rPr>
+                <w:rFonts w:ascii="Arial" w:hAnsi="Arial"/>
+                <w:b/>
+                <w:sz w:val="18"/>
+              </w:rPr>
+              <w:t>环境变量</w:t>
+            </w:r>
+          </w:p>
+        </w:tc>
+        <w:tc>
+          <w:tcPr>
+            <w:tcW w:type="dxa" w:w="3293"/>
+          </w:tcPr>
+          <w:p>
+            <w:pPr>
+              <w:jc w:val="left"/>
+            </w:pPr>
+            <w:r/>
+            <w:r>
+              <w:rPr>
+                <w:rFonts w:ascii="Arial" w:hAnsi="Arial"/>
+                <w:b/>
+                <w:sz w:val="18"/>
+              </w:rPr>
+              <w:t>用途</w:t>
+            </w:r>
+          </w:p>
+        </w:tc>
+      </w:tr>
+      <w:tr>
+        <w:tc>
+          <w:tcPr>
+            <w:tcW w:type="dxa" w:w="3293"/>
+          </w:tcPr>
+          <w:p>
+            <w:pPr>
+              <w:jc w:val="left"/>
+            </w:pPr>
+            <w:r/>
+            <w:r>
+              <w:rPr>
+                <w:rFonts w:ascii="Arial" w:hAnsi="Arial"/>
+                <w:b w:val="0"/>
+                <w:sz w:val="18"/>
+              </w:rPr>
+              <w:t>微信登录</w:t>
+            </w:r>
+          </w:p>
+        </w:tc>
+        <w:tc>
+          <w:tcPr>
+            <w:tcW w:type="dxa" w:w="3293"/>
+          </w:tcPr>
+          <w:p>
+            <w:pPr>
+              <w:jc w:val="left"/>
+            </w:pPr>
+            <w:r/>
+            <w:r>
+              <w:rPr>
+                <w:rFonts w:ascii="Arial" w:hAnsi="Arial"/>
+                <w:b w:val="0"/>
+                <w:sz w:val="18"/>
+              </w:rPr>
+              <w:t>WECHAT_APP_ID, WECHAT_APP_SECRET</w:t>
+            </w:r>
+          </w:p>
+        </w:tc>
+        <w:tc>
+          <w:tcPr>
+            <w:tcW w:type="dxa" w:w="3293"/>
+          </w:tcPr>
+          <w:p>
+            <w:pPr>
+              <w:jc w:val="left"/>
+            </w:pPr>
+            <w:r/>
+            <w:r>
+              <w:rPr>
+                <w:rFonts w:ascii="Arial" w:hAnsi="Arial"/>
+                <w:b w:val="0"/>
+                <w:sz w:val="18"/>
+              </w:rPr>
+              <w:t>调用微信 jscode2session。</w:t>
+            </w:r>
+          </w:p>
+        </w:tc>
+      </w:tr>
+      <w:tr>
+        <w:tc>
+          <w:tcPr>
+            <w:tcW w:type="dxa" w:w="3293"/>
+          </w:tcPr>
+          <w:p>
+            <w:pPr>
+              <w:jc w:val="left"/>
+            </w:pPr>
+            <w:r/>
+            <w:r>
+              <w:rPr>
+                <w:rFonts w:ascii="Arial" w:hAnsi="Arial"/>
+                <w:b w:val="0"/>
+                <w:sz w:val="18"/>
+              </w:rPr>
+              <w:t>腾讯云短信</w:t>
+            </w:r>
+          </w:p>
+        </w:tc>
+        <w:tc>
+          <w:tcPr>
+            <w:tcW w:type="dxa" w:w="3293"/>
+          </w:tcPr>
+          <w:p>
+            <w:pPr>
+              <w:jc w:val="left"/>
+            </w:pPr>
+            <w:r/>
+            <w:r>
+              <w:rPr>
+                <w:rFonts w:ascii="Arial" w:hAnsi="Arial"/>
+                <w:b w:val="0"/>
+                <w:sz w:val="18"/>
+              </w:rPr>
+              <w:t>TENCENT_SECRET_ID, TENCENT_SECRET_KEY, TENCENT_SMS_APP_ID, TENCENT_SMS_SIGN_NAME, TENCENT_SMS_TEMPLATE_ID, TENCENT_SMS_REGION</w:t>
+            </w:r>
+          </w:p>
+        </w:tc>
+        <w:tc>
+          <w:tcPr>
+            <w:tcW w:type="dxa" w:w="3293"/>
+          </w:tcPr>
+          <w:p>
+            <w:pPr>
+              <w:jc w:val="left"/>
+            </w:pPr>
+            <w:r/>
+            <w:r>
+              <w:rPr>
+                <w:rFonts w:ascii="Arial" w:hAnsi="Arial"/>
+                <w:b w:val="0"/>
+                <w:sz w:val="18"/>
+              </w:rPr>
+              <w:t>发送真实短信验证码。</w:t>
+            </w:r>
+          </w:p>
+        </w:tc>
+      </w:tr>
+      <w:tr>
+        <w:tc>
+          <w:tcPr>
+            <w:tcW w:type="dxa" w:w="3293"/>
+          </w:tcPr>
+          <w:p>
+            <w:pPr>
+              <w:jc w:val="left"/>
+            </w:pPr>
+            <w:r/>
+            <w:r>
+              <w:rPr>
+                <w:rFonts w:ascii="Arial" w:hAnsi="Arial"/>
+                <w:b w:val="0"/>
+                <w:sz w:val="18"/>
+              </w:rPr>
+              <w:t>验证码安全</w:t>
+            </w:r>
+          </w:p>
+        </w:tc>
+        <w:tc>
+          <w:tcPr>
+            <w:tcW w:type="dxa" w:w="3293"/>
+          </w:tcPr>
+          <w:p>
+            <w:pPr>
+              <w:jc w:val="left"/>
+            </w:pPr>
+            <w:r/>
+            <w:r>
+              <w:rPr>
+                <w:rFonts w:ascii="Arial" w:hAnsi="Arial"/>
+                <w:b w:val="0"/>
+                <w:sz w:val="18"/>
+              </w:rPr>
+              <w:t>AUTH_CODE_PEPPER</w:t>
+            </w:r>
+          </w:p>
+        </w:tc>
+        <w:tc>
+          <w:tcPr>
+            <w:tcW w:type="dxa" w:w="3293"/>
+          </w:tcPr>
+          <w:p>
+            <w:pPr>
+              <w:jc w:val="left"/>
+            </w:pPr>
+            <w:r/>
+            <w:r>
+              <w:rPr>
+                <w:rFonts w:ascii="Arial" w:hAnsi="Arial"/>
+                <w:b w:val="0"/>
+                <w:sz w:val="18"/>
+              </w:rPr>
+              <w:t>验证码哈希加盐。</w:t>
+            </w:r>
+          </w:p>
+        </w:tc>
+      </w:tr>
+      <w:tr>
+        <w:tc>
+          <w:tcPr>
+            <w:tcW w:type="dxa" w:w="3293"/>
+          </w:tcPr>
+          <w:p>
+            <w:pPr>
+              <w:jc w:val="left"/>
+            </w:pPr>
+            <w:r/>
+            <w:r>
+              <w:rPr>
+                <w:rFonts w:ascii="Arial" w:hAnsi="Arial"/>
+                <w:b w:val="0"/>
+                <w:sz w:val="18"/>
+              </w:rPr>
+              <w:t>前端 API</w:t>
+            </w:r>
+          </w:p>
+        </w:tc>
+        <w:tc>
+          <w:tcPr>
+            <w:tcW w:type="dxa" w:w="3293"/>
+          </w:tcPr>
+          <w:p>
+            <w:pPr>
+              <w:jc w:val="left"/>
+            </w:pPr>
+            <w:r/>
+            <w:r>
+              <w:rPr>
+                <w:rFonts w:ascii="Arial" w:hAnsi="Arial"/>
+                <w:b w:val="0"/>
+                <w:sz w:val="18"/>
+              </w:rPr>
+              <w:t>VITE_API_BASE_URL</w:t>
+            </w:r>
+          </w:p>
+        </w:tc>
+        <w:tc>
+          <w:tcPr>
+            <w:tcW w:type="dxa" w:w="3293"/>
+          </w:tcPr>
+          <w:p>
+            <w:pPr>
+              <w:jc w:val="left"/>
+            </w:pPr>
+            <w:r/>
+            <w:r>
+              <w:rPr>
+                <w:rFonts w:ascii="Arial" w:hAnsi="Arial"/>
+                <w:b w:val="0"/>
+                <w:sz w:val="18"/>
+              </w:rPr>
+              <w:t>H5 指向后端 API 域名。</w:t>
+            </w:r>
+          </w:p>
+        </w:tc>
+      </w:tr>
+    </w:tbl>
+    <w:p/>
+    <w:p>
+      <w:r>
+        <w:t>生产化要求：当前用户、验证码和 session 仍是 Node 内存存储，适合联调和单实例测试；正式上线前必须改为数据库 + Redis，并补齐手机号/IP/设备限流、账号合并、refresh token、审计日志和隐私合规弹窗。</w:t>
+      </w:r>
+    </w:p>
+    <w:p>
+      <w:pPr>
+        <w:pStyle w:val="Heading2"/>
+      </w:pPr>
+      <w:r>
+        <w:t>16.5 后端与数据接口补充</w:t>
+      </w:r>
+    </w:p>
+    <w:tbl>
+      <w:tblPr>
+        <w:tblStyle w:val="TableGrid"/>
+        <w:tblW w:type="auto" w:w="0"/>
+        <w:tblLayout w:type="autofit"/>
+        <w:tblLook w:firstColumn="1" w:firstRow="1" w:lastColumn="0" w:lastRow="0" w:noHBand="0" w:noVBand="1" w:val="04A0"/>
+      </w:tblPr>
+      <w:tblGrid>
+        <w:gridCol w:w="3293"/>
+        <w:gridCol w:w="3293"/>
+        <w:gridCol w:w="3293"/>
+      </w:tblGrid>
+      <w:tr>
+        <w:tc>
+          <w:tcPr>
+            <w:tcW w:type="dxa" w:w="3293"/>
+          </w:tcPr>
+          <w:p>
+            <w:pPr>
+              <w:jc w:val="left"/>
+            </w:pPr>
+            <w:r/>
+            <w:r>
+              <w:rPr>
+                <w:rFonts w:ascii="Arial" w:hAnsi="Arial"/>
+                <w:b/>
+                <w:sz w:val="18"/>
+              </w:rPr>
+              <w:t>接口</w:t>
+            </w:r>
+          </w:p>
+        </w:tc>
+        <w:tc>
+          <w:tcPr>
+            <w:tcW w:type="dxa" w:w="3293"/>
+          </w:tcPr>
+          <w:p>
+            <w:pPr>
+              <w:jc w:val="left"/>
+            </w:pPr>
+            <w:r/>
+            <w:r>
+              <w:rPr>
+                <w:rFonts w:ascii="Arial" w:hAnsi="Arial"/>
+                <w:b/>
+                <w:sz w:val="18"/>
+              </w:rPr>
+              <w:t>用途</w:t>
+            </w:r>
+          </w:p>
+        </w:tc>
+        <w:tc>
+          <w:tcPr>
+            <w:tcW w:type="dxa" w:w="3293"/>
+          </w:tcPr>
+          <w:p>
+            <w:pPr>
+              <w:jc w:val="left"/>
+            </w:pPr>
+            <w:r/>
+            <w:r>
+              <w:rPr>
+                <w:rFonts w:ascii="Arial" w:hAnsi="Arial"/>
+                <w:b/>
+                <w:sz w:val="18"/>
+              </w:rPr>
+              <w:t>生产化备注</w:t>
+            </w:r>
+          </w:p>
+        </w:tc>
+      </w:tr>
+      <w:tr>
+        <w:tc>
+          <w:tcPr>
+            <w:tcW w:type="dxa" w:w="3293"/>
+          </w:tcPr>
+          <w:p>
+            <w:pPr>
+              <w:jc w:val="left"/>
+            </w:pPr>
+            <w:r/>
+            <w:r>
+              <w:rPr>
+                <w:rFonts w:ascii="Arial" w:hAnsi="Arial"/>
+                <w:b w:val="0"/>
+                <w:sz w:val="18"/>
+              </w:rPr>
+              <w:t>GET /api/bootstrap</w:t>
+            </w:r>
+          </w:p>
+        </w:tc>
+        <w:tc>
+          <w:tcPr>
+            <w:tcW w:type="dxa" w:w="3293"/>
+          </w:tcPr>
+          <w:p>
+            <w:pPr>
+              <w:jc w:val="left"/>
+            </w:pPr>
+            <w:r/>
+            <w:r>
+              <w:rPr>
+                <w:rFonts w:ascii="Arial" w:hAnsi="Arial"/>
+                <w:b w:val="0"/>
+                <w:sz w:val="18"/>
+              </w:rPr>
+              <w:t>首屏聚合数据</w:t>
+            </w:r>
+          </w:p>
+        </w:tc>
+        <w:tc>
+          <w:tcPr>
+            <w:tcW w:type="dxa" w:w="3293"/>
+          </w:tcPr>
+          <w:p>
+            <w:pPr>
+              <w:jc w:val="left"/>
+            </w:pPr>
+            <w:r/>
+            <w:r>
+              <w:rPr>
+                <w:rFonts w:ascii="Arial" w:hAnsi="Arial"/>
+                <w:b w:val="0"/>
+                <w:sz w:val="18"/>
+              </w:rPr>
+              <w:t>后续可由静态 JSON 过渡到 CDN 缓存 API。</w:t>
+            </w:r>
+          </w:p>
+        </w:tc>
+      </w:tr>
+      <w:tr>
+        <w:tc>
+          <w:tcPr>
+            <w:tcW w:type="dxa" w:w="3293"/>
+          </w:tcPr>
+          <w:p>
+            <w:pPr>
+              <w:jc w:val="left"/>
+            </w:pPr>
+            <w:r/>
+            <w:r>
+              <w:rPr>
+                <w:rFonts w:ascii="Arial" w:hAnsi="Arial"/>
+                <w:b w:val="0"/>
+                <w:sz w:val="18"/>
+              </w:rPr>
+              <w:t>GET /api/leagues</w:t>
+            </w:r>
+          </w:p>
+        </w:tc>
+        <w:tc>
+          <w:tcPr>
+            <w:tcW w:type="dxa" w:w="3293"/>
+          </w:tcPr>
+          <w:p>
+            <w:pPr>
+              <w:jc w:val="left"/>
+            </w:pPr>
+            <w:r/>
+            <w:r>
+              <w:rPr>
+                <w:rFonts w:ascii="Arial" w:hAnsi="Arial"/>
+                <w:b w:val="0"/>
+                <w:sz w:val="18"/>
+              </w:rPr>
+              <w:t>联赛列表</w:t>
+            </w:r>
+          </w:p>
+        </w:tc>
+        <w:tc>
+          <w:tcPr>
+            <w:tcW w:type="dxa" w:w="3293"/>
+          </w:tcPr>
+          <w:p>
+            <w:pPr>
+              <w:jc w:val="left"/>
+            </w:pPr>
+            <w:r/>
+            <w:r>
+              <w:rPr>
+                <w:rFonts w:ascii="Arial" w:hAnsi="Arial"/>
+                <w:b w:val="0"/>
+                <w:sz w:val="18"/>
+              </w:rPr>
+              <w:t>需支持多联赛排序、地区、热度和关注态。</w:t>
+            </w:r>
+          </w:p>
+        </w:tc>
+      </w:tr>
+      <w:tr>
+        <w:tc>
+          <w:tcPr>
+            <w:tcW w:type="dxa" w:w="3293"/>
+          </w:tcPr>
+          <w:p>
+            <w:pPr>
+              <w:jc w:val="left"/>
+            </w:pPr>
+            <w:r/>
+            <w:r>
+              <w:rPr>
+                <w:rFonts w:ascii="Arial" w:hAnsi="Arial"/>
+                <w:b w:val="0"/>
+                <w:sz w:val="18"/>
+              </w:rPr>
+              <w:t>GET /api/matches</w:t>
+            </w:r>
+          </w:p>
+        </w:tc>
+        <w:tc>
+          <w:tcPr>
+            <w:tcW w:type="dxa" w:w="3293"/>
+          </w:tcPr>
+          <w:p>
+            <w:pPr>
+              <w:jc w:val="left"/>
+            </w:pPr>
+            <w:r/>
+            <w:r>
+              <w:rPr>
+                <w:rFonts w:ascii="Arial" w:hAnsi="Arial"/>
+                <w:b w:val="0"/>
+                <w:sz w:val="18"/>
+              </w:rPr>
+              <w:t>比赛列表</w:t>
+            </w:r>
+          </w:p>
+        </w:tc>
+        <w:tc>
+          <w:tcPr>
+            <w:tcW w:type="dxa" w:w="3293"/>
+          </w:tcPr>
+          <w:p>
+            <w:pPr>
+              <w:jc w:val="left"/>
+            </w:pPr>
+            <w:r/>
+            <w:r>
+              <w:rPr>
+                <w:rFonts w:ascii="Arial" w:hAnsi="Arial"/>
+                <w:b w:val="0"/>
+                <w:sz w:val="18"/>
+              </w:rPr>
+              <w:t>需支持联赛、日期、状态、球队、场地筛选。</w:t>
+            </w:r>
+          </w:p>
+        </w:tc>
+      </w:tr>
+      <w:tr>
+        <w:tc>
+          <w:tcPr>
+            <w:tcW w:type="dxa" w:w="3293"/>
+          </w:tcPr>
+          <w:p>
+            <w:pPr>
+              <w:jc w:val="left"/>
+            </w:pPr>
+            <w:r/>
+            <w:r>
+              <w:rPr>
+                <w:rFonts w:ascii="Arial" w:hAnsi="Arial"/>
+                <w:b w:val="0"/>
+                <w:sz w:val="18"/>
+              </w:rPr>
+              <w:t>GET /api/matches/:id</w:t>
+            </w:r>
+          </w:p>
+        </w:tc>
+        <w:tc>
+          <w:tcPr>
+            <w:tcW w:type="dxa" w:w="3293"/>
+          </w:tcPr>
+          <w:p>
+            <w:pPr>
+              <w:jc w:val="left"/>
+            </w:pPr>
+            <w:r/>
+            <w:r>
+              <w:rPr>
+                <w:rFonts w:ascii="Arial" w:hAnsi="Arial"/>
+                <w:b w:val="0"/>
+                <w:sz w:val="18"/>
+              </w:rPr>
+              <w:t>比赛详情</w:t>
+            </w:r>
+          </w:p>
+        </w:tc>
+        <w:tc>
+          <w:tcPr>
+            <w:tcW w:type="dxa" w:w="3293"/>
+          </w:tcPr>
+          <w:p>
+            <w:pPr>
+              <w:jc w:val="left"/>
+            </w:pPr>
+            <w:r/>
+            <w:r>
+              <w:rPr>
+                <w:rFonts w:ascii="Arial" w:hAnsi="Arial"/>
+                <w:b w:val="0"/>
+                <w:sz w:val="18"/>
+              </w:rPr>
+              <w:t>需接入比分、事件、阵容、评论与预约。</w:t>
+            </w:r>
+          </w:p>
+        </w:tc>
+      </w:tr>
+      <w:tr>
+        <w:tc>
+          <w:tcPr>
+            <w:tcW w:type="dxa" w:w="3293"/>
+          </w:tcPr>
+          <w:p>
+            <w:pPr>
+              <w:jc w:val="left"/>
+            </w:pPr>
+            <w:r/>
+            <w:r>
+              <w:rPr>
+                <w:rFonts w:ascii="Arial" w:hAnsi="Arial"/>
+                <w:b w:val="0"/>
+                <w:sz w:val="18"/>
+              </w:rPr>
+              <w:t>GET /api/teams/:id</w:t>
+            </w:r>
+          </w:p>
+        </w:tc>
+        <w:tc>
+          <w:tcPr>
+            <w:tcW w:type="dxa" w:w="3293"/>
+          </w:tcPr>
+          <w:p>
+            <w:pPr>
+              <w:jc w:val="left"/>
+            </w:pPr>
+            <w:r/>
+            <w:r>
+              <w:rPr>
+                <w:rFonts w:ascii="Arial" w:hAnsi="Arial"/>
+                <w:b w:val="0"/>
+                <w:sz w:val="18"/>
+              </w:rPr>
+              <w:t>球队详情</w:t>
+            </w:r>
+          </w:p>
+        </w:tc>
+        <w:tc>
+          <w:tcPr>
+            <w:tcW w:type="dxa" w:w="3293"/>
+          </w:tcPr>
+          <w:p>
+            <w:pPr>
+              <w:jc w:val="left"/>
+            </w:pPr>
+            <w:r/>
+            <w:r>
+              <w:rPr>
+                <w:rFonts w:ascii="Arial" w:hAnsi="Arial"/>
+                <w:b w:val="0"/>
+                <w:sz w:val="18"/>
+              </w:rPr>
+              <w:t>需接入球队资料、球员、赛程、讨论和文旅。</w:t>
+            </w:r>
+          </w:p>
+        </w:tc>
+      </w:tr>
+      <w:tr>
+        <w:tc>
+          <w:tcPr>
+            <w:tcW w:type="dxa" w:w="3293"/>
+          </w:tcPr>
+          <w:p>
+            <w:pPr>
+              <w:jc w:val="left"/>
+            </w:pPr>
+            <w:r/>
+            <w:r>
+              <w:rPr>
+                <w:rFonts w:ascii="Arial" w:hAnsi="Arial"/>
+                <w:b w:val="0"/>
+                <w:sz w:val="18"/>
+              </w:rPr>
+              <w:t>GET /api/content/:id</w:t>
+            </w:r>
+          </w:p>
+        </w:tc>
+        <w:tc>
+          <w:tcPr>
+            <w:tcW w:type="dxa" w:w="3293"/>
+          </w:tcPr>
+          <w:p>
+            <w:pPr>
+              <w:jc w:val="left"/>
+            </w:pPr>
+            <w:r/>
+            <w:r>
+              <w:rPr>
+                <w:rFonts w:ascii="Arial" w:hAnsi="Arial"/>
+                <w:b w:val="0"/>
+                <w:sz w:val="18"/>
+              </w:rPr>
+              <w:t>资讯详情</w:t>
+            </w:r>
+          </w:p>
+        </w:tc>
+        <w:tc>
+          <w:tcPr>
+            <w:tcW w:type="dxa" w:w="3293"/>
+          </w:tcPr>
+          <w:p>
+            <w:pPr>
+              <w:jc w:val="left"/>
+            </w:pPr>
+            <w:r/>
+            <w:r>
+              <w:rPr>
+                <w:rFonts w:ascii="Arial" w:hAnsi="Arial"/>
+                <w:b w:val="0"/>
+                <w:sz w:val="18"/>
+              </w:rPr>
+              <w:t>需保留来源、图片、正文、版权和互动数据。</w:t>
+            </w:r>
+          </w:p>
+        </w:tc>
+      </w:tr>
+      <w:tr>
+        <w:tc>
+          <w:tcPr>
+            <w:tcW w:type="dxa" w:w="3293"/>
+          </w:tcPr>
+          <w:p>
+            <w:pPr>
+              <w:jc w:val="left"/>
+            </w:pPr>
+            <w:r/>
+            <w:r>
+              <w:rPr>
+                <w:rFonts w:ascii="Arial" w:hAnsi="Arial"/>
+                <w:b w:val="0"/>
+                <w:sz w:val="18"/>
+              </w:rPr>
+              <w:t>GET /api/posts/:id</w:t>
+            </w:r>
+          </w:p>
+        </w:tc>
+        <w:tc>
+          <w:tcPr>
+            <w:tcW w:type="dxa" w:w="3293"/>
+          </w:tcPr>
+          <w:p>
+            <w:pPr>
+              <w:jc w:val="left"/>
+            </w:pPr>
+            <w:r/>
+            <w:r>
+              <w:rPr>
+                <w:rFonts w:ascii="Arial" w:hAnsi="Arial"/>
+                <w:b w:val="0"/>
+                <w:sz w:val="18"/>
+              </w:rPr>
+              <w:t>帖子详情</w:t>
+            </w:r>
+          </w:p>
+        </w:tc>
+        <w:tc>
+          <w:tcPr>
+            <w:tcW w:type="dxa" w:w="3293"/>
+          </w:tcPr>
+          <w:p>
+            <w:pPr>
+              <w:jc w:val="left"/>
+            </w:pPr>
+            <w:r/>
+            <w:r>
+              <w:rPr>
+                <w:rFonts w:ascii="Arial" w:hAnsi="Arial"/>
+                <w:b w:val="0"/>
+                <w:sz w:val="18"/>
+              </w:rPr>
+              <w:t>需接入评论分页、点赞、举报、审核。</w:t>
+            </w:r>
+          </w:p>
+        </w:tc>
+      </w:tr>
+      <w:tr>
+        <w:tc>
+          <w:tcPr>
+            <w:tcW w:type="dxa" w:w="3293"/>
+          </w:tcPr>
+          <w:p>
+            <w:pPr>
+              <w:jc w:val="left"/>
+            </w:pPr>
+            <w:r/>
+            <w:r>
+              <w:rPr>
+                <w:rFonts w:ascii="Arial" w:hAnsi="Arial"/>
+                <w:b w:val="0"/>
+                <w:sz w:val="18"/>
+              </w:rPr>
+              <w:t>GET /api/bookings</w:t>
+            </w:r>
+          </w:p>
+        </w:tc>
+        <w:tc>
+          <w:tcPr>
+            <w:tcW w:type="dxa" w:w="3293"/>
+          </w:tcPr>
+          <w:p>
+            <w:pPr>
+              <w:jc w:val="left"/>
+            </w:pPr>
+            <w:r/>
+            <w:r>
+              <w:rPr>
+                <w:rFonts w:ascii="Arial" w:hAnsi="Arial"/>
+                <w:b w:val="0"/>
+                <w:sz w:val="18"/>
+              </w:rPr>
+              <w:t>可预约场次</w:t>
+            </w:r>
+          </w:p>
+        </w:tc>
+        <w:tc>
+          <w:tcPr>
+            <w:tcW w:type="dxa" w:w="3293"/>
+          </w:tcPr>
+          <w:p>
+            <w:pPr>
+              <w:jc w:val="left"/>
+            </w:pPr>
+            <w:r/>
+            <w:r>
+              <w:rPr>
+                <w:rFonts w:ascii="Arial" w:hAnsi="Arial"/>
+                <w:b w:val="0"/>
+                <w:sz w:val="18"/>
+              </w:rPr>
+              <w:t>需和官方/第三方预约平台打通或跳转。</w:t>
+            </w:r>
+          </w:p>
+        </w:tc>
+      </w:tr>
+    </w:tbl>
+    <w:p/>
+    <w:p>
+      <w:pPr>
+        <w:pStyle w:val="Heading2"/>
+      </w:pPr>
+      <w:r>
+        <w:t>16.6 新增产品需求</w:t>
+      </w:r>
+    </w:p>
+    <w:p>
+      <w:pPr>
+        <w:pStyle w:val="ListBullet"/>
+      </w:pPr>
+      <w:r>
+        <w:t>数据后台必须支持“自动抓取 + 人工审核 + 官方数据导入”三种数据来源，并记录每条数据的来源、更新时间、可信等级和最后审核人。</w:t>
+      </w:r>
+    </w:p>
+    <w:p>
+      <w:pPr>
+        <w:pStyle w:val="ListBullet"/>
+      </w:pPr>
+      <w:r>
+        <w:t>资讯详情必须优先站内可读，同时保留原文链接；若版权不允许全文抓取，则至少展示标题、封面图、摘要、来源、发布时间和跳转入口。</w:t>
+      </w:r>
+    </w:p>
+    <w:p>
+      <w:pPr>
+        <w:pStyle w:val="ListBullet"/>
+      </w:pPr>
+      <w:r>
+        <w:t>赛事页默认展示未来 14 天比赛；未开始比赛不显示比分，只显示时间、球队、场地、联赛和预约/提醒入口。</w:t>
+      </w:r>
+    </w:p>
+    <w:p>
+      <w:pPr>
+        <w:pStyle w:val="ListBullet"/>
+      </w:pPr>
+      <w:r>
+        <w:t>文旅页主逻辑从静态攻略改为“由未来比赛驱动的村寨/球队攻略”，包括村寨介绍、球队介绍、队员介绍、旅游、住宿、饮食、交通和比赛日建议。</w:t>
+      </w:r>
+    </w:p>
+    <w:p>
+      <w:pPr>
+        <w:pStyle w:val="ListBullet"/>
+      </w:pPr>
+      <w:r>
+        <w:t>社区模拟内容只用于测试氛围和样式，正式上线必须区分真实用户内容、运营初始化内容和机器生成种子内容，避免误导用户。</w:t>
+      </w:r>
+    </w:p>
+    <w:p>
+      <w:pPr>
+        <w:pStyle w:val="ListBullet"/>
+      </w:pPr>
+      <w:r>
+        <w:t>用户在资讯、帖子、评论、球队、比赛、文旅攻略中的点赞、评论、收藏、关注、预约，都需要沉淀到“我的”。</w:t>
+      </w:r>
+    </w:p>
+    <w:p>
+      <w:pPr>
+        <w:pStyle w:val="ListBullet"/>
+      </w:pPr>
+      <w:r>
+        <w:t>Android APK 当前可跟随 H5/Vercel 内容变化；若后续要上架应用市场，需要补充原生启动页、隐私政策、权限说明、推送、版本更新和备案合规。</w:t>
+      </w:r>
+    </w:p>
+    <w:p>
+      <w:pPr>
+        <w:pStyle w:val="Heading2"/>
+      </w:pPr>
+      <w:r>
+        <w:t>16.7 下一步优先级</w:t>
+      </w:r>
+    </w:p>
+    <w:tbl>
+      <w:tblPr>
+        <w:tblStyle w:val="TableGrid"/>
+        <w:tblW w:type="auto" w:w="0"/>
+        <w:tblLayout w:type="autofit"/>
+        <w:tblLook w:firstColumn="1" w:firstRow="1" w:lastColumn="0" w:lastRow="0" w:noHBand="0" w:noVBand="1" w:val="04A0"/>
+      </w:tblPr>
+      <w:tblGrid>
+        <w:gridCol w:w="3293"/>
+        <w:gridCol w:w="3293"/>
+        <w:gridCol w:w="3293"/>
+      </w:tblGrid>
+      <w:tr>
+        <w:tc>
+          <w:tcPr>
+            <w:tcW w:type="dxa" w:w="3293"/>
+          </w:tcPr>
+          <w:p>
+            <w:pPr>
+              <w:jc w:val="left"/>
+            </w:pPr>
+            <w:r/>
+            <w:r>
+              <w:rPr>
+                <w:rFonts w:ascii="Arial" w:hAnsi="Arial"/>
+                <w:b/>
+                <w:sz w:val="18"/>
+              </w:rPr>
+              <w:t>优先级</w:t>
+            </w:r>
+          </w:p>
+        </w:tc>
+        <w:tc>
+          <w:tcPr>
+            <w:tcW w:type="dxa" w:w="3293"/>
+          </w:tcPr>
+          <w:p>
+            <w:pPr>
+              <w:jc w:val="left"/>
+            </w:pPr>
+            <w:r/>
+            <w:r>
+              <w:rPr>
+                <w:rFonts w:ascii="Arial" w:hAnsi="Arial"/>
+                <w:b/>
+                <w:sz w:val="18"/>
+              </w:rPr>
+              <w:t>工作项</w:t>
+            </w:r>
+          </w:p>
+        </w:tc>
+        <w:tc>
+          <w:tcPr>
+            <w:tcW w:type="dxa" w:w="3293"/>
+          </w:tcPr>
+          <w:p>
+            <w:pPr>
+              <w:jc w:val="left"/>
+            </w:pPr>
+            <w:r/>
+            <w:r>
+              <w:rPr>
+                <w:rFonts w:ascii="Arial" w:hAnsi="Arial"/>
+                <w:b/>
+                <w:sz w:val="18"/>
+              </w:rPr>
+              <w:t>目标</w:t>
+            </w:r>
+          </w:p>
+        </w:tc>
+      </w:tr>
+      <w:tr>
+        <w:tc>
+          <w:tcPr>
+            <w:tcW w:type="dxa" w:w="3293"/>
+          </w:tcPr>
+          <w:p>
+            <w:pPr>
+              <w:jc w:val="left"/>
+            </w:pPr>
+            <w:r/>
+            <w:r>
+              <w:rPr>
+                <w:rFonts w:ascii="Arial" w:hAnsi="Arial"/>
+                <w:b w:val="0"/>
+                <w:sz w:val="18"/>
+              </w:rPr>
+              <w:t>P0</w:t>
+            </w:r>
+          </w:p>
+        </w:tc>
+        <w:tc>
+          <w:tcPr>
+            <w:tcW w:type="dxa" w:w="3293"/>
+          </w:tcPr>
+          <w:p>
+            <w:pPr>
+              <w:jc w:val="left"/>
+            </w:pPr>
+            <w:r/>
+            <w:r>
+              <w:rPr>
+                <w:rFonts w:ascii="Arial" w:hAnsi="Arial"/>
+                <w:b w:val="0"/>
+                <w:sz w:val="18"/>
+              </w:rPr>
+              <w:t>数据持久化</w:t>
+            </w:r>
+          </w:p>
+        </w:tc>
+        <w:tc>
+          <w:tcPr>
+            <w:tcW w:type="dxa" w:w="3293"/>
+          </w:tcPr>
+          <w:p>
+            <w:pPr>
+              <w:jc w:val="left"/>
+            </w:pPr>
+            <w:r/>
+            <w:r>
+              <w:rPr>
+                <w:rFonts w:ascii="Arial" w:hAnsi="Arial"/>
+                <w:b w:val="0"/>
+                <w:sz w:val="18"/>
+              </w:rPr>
+              <w:t>用 PostgreSQL/MySQL + Redis 替代内存用户/session/验证码，并保存互动行为。</w:t>
+            </w:r>
+          </w:p>
+        </w:tc>
+      </w:tr>
+      <w:tr>
+        <w:tc>
+          <w:tcPr>
+            <w:tcW w:type="dxa" w:w="3293"/>
+          </w:tcPr>
+          <w:p>
+            <w:pPr>
+              <w:jc w:val="left"/>
+            </w:pPr>
+            <w:r/>
+            <w:r>
+              <w:rPr>
+                <w:rFonts w:ascii="Arial" w:hAnsi="Arial"/>
+                <w:b w:val="0"/>
+                <w:sz w:val="18"/>
+              </w:rPr>
+              <w:t>P0</w:t>
+            </w:r>
+          </w:p>
+        </w:tc>
+        <w:tc>
+          <w:tcPr>
+            <w:tcW w:type="dxa" w:w="3293"/>
+          </w:tcPr>
+          <w:p>
+            <w:pPr>
+              <w:jc w:val="left"/>
+            </w:pPr>
+            <w:r/>
+            <w:r>
+              <w:rPr>
+                <w:rFonts w:ascii="Arial" w:hAnsi="Arial"/>
+                <w:b w:val="0"/>
+                <w:sz w:val="18"/>
+              </w:rPr>
+              <w:t>真实 API 部署</w:t>
+            </w:r>
+          </w:p>
+        </w:tc>
+        <w:tc>
+          <w:tcPr>
+            <w:tcW w:type="dxa" w:w="3293"/>
+          </w:tcPr>
+          <w:p>
+            <w:pPr>
+              <w:jc w:val="left"/>
+            </w:pPr>
+            <w:r/>
+            <w:r>
+              <w:rPr>
+                <w:rFonts w:ascii="Arial" w:hAnsi="Arial"/>
+                <w:b w:val="0"/>
+                <w:sz w:val="18"/>
+              </w:rPr>
+              <w:t>为 H5、小程序和 APK 提供稳定后端域名，配置 VITE_API_BASE_URL。</w:t>
+            </w:r>
+          </w:p>
+        </w:tc>
+      </w:tr>
+      <w:tr>
+        <w:tc>
+          <w:tcPr>
+            <w:tcW w:type="dxa" w:w="3293"/>
+          </w:tcPr>
+          <w:p>
+            <w:pPr>
+              <w:jc w:val="left"/>
+            </w:pPr>
+            <w:r/>
+            <w:r>
+              <w:rPr>
+                <w:rFonts w:ascii="Arial" w:hAnsi="Arial"/>
+                <w:b w:val="0"/>
+                <w:sz w:val="18"/>
+              </w:rPr>
+              <w:t>P0</w:t>
+            </w:r>
+          </w:p>
+        </w:tc>
+        <w:tc>
+          <w:tcPr>
+            <w:tcW w:type="dxa" w:w="3293"/>
+          </w:tcPr>
+          <w:p>
+            <w:pPr>
+              <w:jc w:val="left"/>
+            </w:pPr>
+            <w:r/>
+            <w:r>
+              <w:rPr>
+                <w:rFonts w:ascii="Arial" w:hAnsi="Arial"/>
+                <w:b w:val="0"/>
+                <w:sz w:val="18"/>
+              </w:rPr>
+              <w:t>数据合作清单</w:t>
+            </w:r>
+          </w:p>
+        </w:tc>
+        <w:tc>
+          <w:tcPr>
+            <w:tcW w:type="dxa" w:w="3293"/>
+          </w:tcPr>
+          <w:p>
+            <w:pPr>
+              <w:jc w:val="left"/>
+            </w:pPr>
+            <w:r/>
+            <w:r>
+              <w:rPr>
+                <w:rFonts w:ascii="Arial" w:hAnsi="Arial"/>
+                <w:b w:val="0"/>
+                <w:sz w:val="18"/>
+              </w:rPr>
+              <w:t>明确村超、苏超、青超等联赛的赛程、比分、球队、球员和预约数据责任方。</w:t>
+            </w:r>
+          </w:p>
+        </w:tc>
+      </w:tr>
+      <w:tr>
+        <w:tc>
+          <w:tcPr>
+            <w:tcW w:type="dxa" w:w="3293"/>
+          </w:tcPr>
+          <w:p>
+            <w:pPr>
+              <w:jc w:val="left"/>
+            </w:pPr>
+            <w:r/>
+            <w:r>
+              <w:rPr>
+                <w:rFonts w:ascii="Arial" w:hAnsi="Arial"/>
+                <w:b w:val="0"/>
+                <w:sz w:val="18"/>
+              </w:rPr>
+              <w:t>P1</w:t>
+            </w:r>
+          </w:p>
+        </w:tc>
+        <w:tc>
+          <w:tcPr>
+            <w:tcW w:type="dxa" w:w="3293"/>
+          </w:tcPr>
+          <w:p>
+            <w:pPr>
+              <w:jc w:val="left"/>
+            </w:pPr>
+            <w:r/>
+            <w:r>
+              <w:rPr>
+                <w:rFonts w:ascii="Arial" w:hAnsi="Arial"/>
+                <w:b w:val="0"/>
+                <w:sz w:val="18"/>
+              </w:rPr>
+              <w:t>小程序适配</w:t>
+            </w:r>
+          </w:p>
+        </w:tc>
+        <w:tc>
+          <w:tcPr>
+            <w:tcW w:type="dxa" w:w="3293"/>
+          </w:tcPr>
+          <w:p>
+            <w:pPr>
+              <w:jc w:val="left"/>
+            </w:pPr>
+            <w:r/>
+            <w:r>
+              <w:rPr>
+                <w:rFonts w:ascii="Arial" w:hAnsi="Arial"/>
+                <w:b w:val="0"/>
+                <w:sz w:val="18"/>
+              </w:rPr>
+              <w:t>将微信登录、订阅消息、预约跳转、分享卡片按小程序规范落地。</w:t>
+            </w:r>
+          </w:p>
+        </w:tc>
+      </w:tr>
+      <w:tr>
+        <w:tc>
+          <w:tcPr>
+            <w:tcW w:type="dxa" w:w="3293"/>
+          </w:tcPr>
+          <w:p>
+            <w:pPr>
+              <w:jc w:val="left"/>
+            </w:pPr>
+            <w:r/>
+            <w:r>
+              <w:rPr>
+                <w:rFonts w:ascii="Arial" w:hAnsi="Arial"/>
+                <w:b w:val="0"/>
+                <w:sz w:val="18"/>
+              </w:rPr>
+              <w:t>P1</w:t>
+            </w:r>
+          </w:p>
+        </w:tc>
+        <w:tc>
+          <w:tcPr>
+            <w:tcW w:type="dxa" w:w="3293"/>
+          </w:tcPr>
+          <w:p>
+            <w:pPr>
+              <w:jc w:val="left"/>
+            </w:pPr>
+            <w:r/>
+            <w:r>
+              <w:rPr>
+                <w:rFonts w:ascii="Arial" w:hAnsi="Arial"/>
+                <w:b w:val="0"/>
+                <w:sz w:val="18"/>
+              </w:rPr>
+              <w:t>内容审核后台</w:t>
+            </w:r>
+          </w:p>
+        </w:tc>
+        <w:tc>
+          <w:tcPr>
+            <w:tcW w:type="dxa" w:w="3293"/>
+          </w:tcPr>
+          <w:p>
+            <w:pPr>
+              <w:jc w:val="left"/>
+            </w:pPr>
+            <w:r/>
+            <w:r>
+              <w:rPr>
+                <w:rFonts w:ascii="Arial" w:hAnsi="Arial"/>
+                <w:b w:val="0"/>
+                <w:sz w:val="18"/>
+              </w:rPr>
+              <w:t>支持资讯入库审核、社区帖子/评论审核、举报处理和敏感词。</w:t>
+            </w:r>
+          </w:p>
+        </w:tc>
+      </w:tr>
+      <w:tr>
+        <w:tc>
+          <w:tcPr>
+            <w:tcW w:type="dxa" w:w="3293"/>
+          </w:tcPr>
+          <w:p>
+            <w:pPr>
+              <w:jc w:val="left"/>
+            </w:pPr>
+            <w:r/>
+            <w:r>
+              <w:rPr>
+                <w:rFonts w:ascii="Arial" w:hAnsi="Arial"/>
+                <w:b w:val="0"/>
+                <w:sz w:val="18"/>
+              </w:rPr>
+              <w:t>P1</w:t>
+            </w:r>
+          </w:p>
+        </w:tc>
+        <w:tc>
+          <w:tcPr>
+            <w:tcW w:type="dxa" w:w="3293"/>
+          </w:tcPr>
+          <w:p>
+            <w:pPr>
+              <w:jc w:val="left"/>
+            </w:pPr>
+            <w:r/>
+            <w:r>
+              <w:rPr>
+                <w:rFonts w:ascii="Arial" w:hAnsi="Arial"/>
+                <w:b w:val="0"/>
+                <w:sz w:val="18"/>
+              </w:rPr>
+              <w:t>国内部署</w:t>
+            </w:r>
+          </w:p>
+        </w:tc>
+        <w:tc>
+          <w:tcPr>
+            <w:tcW w:type="dxa" w:w="3293"/>
+          </w:tcPr>
+          <w:p>
+            <w:pPr>
+              <w:jc w:val="left"/>
+            </w:pPr>
+            <w:r/>
+            <w:r>
+              <w:rPr>
+                <w:rFonts w:ascii="Arial" w:hAnsi="Arial"/>
+                <w:b w:val="0"/>
+                <w:sz w:val="18"/>
+              </w:rPr>
+              <w:t>准备备案域名、国内 OSS/COS + CDN，降低大陆用户访问门槛。</w:t>
+            </w:r>
+          </w:p>
+        </w:tc>
+      </w:tr>
+      <w:tr>
+        <w:tc>
+          <w:tcPr>
+            <w:tcW w:type="dxa" w:w="3293"/>
+          </w:tcPr>
+          <w:p>
+            <w:pPr>
+              <w:jc w:val="left"/>
+            </w:pPr>
+            <w:r/>
+            <w:r>
+              <w:rPr>
+                <w:rFonts w:ascii="Arial" w:hAnsi="Arial"/>
+                <w:b w:val="0"/>
+                <w:sz w:val="18"/>
+              </w:rPr>
+              <w:t>P2</w:t>
+            </w:r>
+          </w:p>
+        </w:tc>
+        <w:tc>
+          <w:tcPr>
+            <w:tcW w:type="dxa" w:w="3293"/>
+          </w:tcPr>
+          <w:p>
+            <w:pPr>
+              <w:jc w:val="left"/>
+            </w:pPr>
+            <w:r/>
+            <w:r>
+              <w:rPr>
+                <w:rFonts w:ascii="Arial" w:hAnsi="Arial"/>
+                <w:b w:val="0"/>
+                <w:sz w:val="18"/>
+              </w:rPr>
+              <w:t>数据看板</w:t>
+            </w:r>
+          </w:p>
+        </w:tc>
+        <w:tc>
+          <w:tcPr>
+            <w:tcW w:type="dxa" w:w="3293"/>
+          </w:tcPr>
+          <w:p>
+            <w:pPr>
+              <w:jc w:val="left"/>
+            </w:pPr>
+            <w:r/>
+            <w:r>
+              <w:rPr>
+                <w:rFonts w:ascii="Arial" w:hAnsi="Arial"/>
+                <w:b w:val="0"/>
+                <w:sz w:val="18"/>
+              </w:rPr>
+              <w:t>追踪资讯更新量、比赛覆盖率、用户互动、热门球队和文旅点击。</w:t>
+            </w:r>
+          </w:p>
+        </w:tc>
+      </w:tr>
+    </w:tbl>
+    <w:p/>
     <w:sectPr>
       <w:pgSz w:w="12240" w:h="15840"/>
       <w:pgMar w:top="1080" w:right="1181" w:bottom="1080" w:left="1181" w:header="720" w:footer="720" w:gutter="0"/>
@@ -8290,7 +11728,7 @@
     <w:rsid w:val="00FC693F"/>
     <w:rPr>
       <w:rFonts w:ascii="Arial" w:hAnsi="Arial" w:eastAsia="Microsoft YaHei"/>
-      <w:sz w:val="20"/>
+      <w:sz w:val="21"/>
     </w:rPr>
   </w:style>
   <w:style w:type="paragraph" w:styleId="Header">
@@ -8352,11 +11790,11 @@
       <w:outlineLvl w:val="0"/>
     </w:pPr>
     <w:rPr>
-      <w:rFonts w:asciiTheme="majorHAnsi" w:eastAsiaTheme="majorEastAsia" w:hAnsiTheme="majorHAnsi" w:cstheme="majorBidi"/>
+      <w:rFonts w:asciiTheme="majorHAnsi" w:eastAsiaTheme="majorEastAsia" w:hAnsiTheme="majorHAnsi" w:cstheme="majorBidi" w:ascii="Arial" w:hAnsi="Arial"/>
       <w:b/>
       <w:bCs/>
-      <w:color w:val="365F91" w:themeColor="accent1" w:themeShade="BF"/>
-      <w:sz w:val="28"/>
+      <w:color w:val="9F1239"/>
+      <w:sz w:val="32"/>
       <w:szCs w:val="28"/>
     </w:rPr>
   </w:style>
@@ -8376,10 +11814,10 @@
       <w:outlineLvl w:val="1"/>
     </w:pPr>
     <w:rPr>
-      <w:rFonts w:asciiTheme="majorHAnsi" w:eastAsiaTheme="majorEastAsia" w:hAnsiTheme="majorHAnsi" w:cstheme="majorBidi"/>
+      <w:rFonts w:asciiTheme="majorHAnsi" w:eastAsiaTheme="majorEastAsia" w:hAnsiTheme="majorHAnsi" w:cstheme="majorBidi" w:ascii="Arial" w:hAnsi="Arial"/>
       <w:b/>
       <w:bCs/>
-      <w:color w:val="4F81BD" w:themeColor="accent1"/>
+      <w:color w:val="1F2937"/>
       <w:sz w:val="26"/>
       <w:szCs w:val="26"/>
     </w:rPr>
@@ -8400,10 +11838,11 @@
       <w:outlineLvl w:val="2"/>
     </w:pPr>
     <w:rPr>
-      <w:rFonts w:asciiTheme="majorHAnsi" w:eastAsiaTheme="majorEastAsia" w:hAnsiTheme="majorHAnsi" w:cstheme="majorBidi"/>
+      <w:rFonts w:asciiTheme="majorHAnsi" w:eastAsiaTheme="majorEastAsia" w:hAnsiTheme="majorHAnsi" w:cstheme="majorBidi" w:ascii="Arial" w:hAnsi="Arial"/>
       <w:b/>
       <w:bCs/>
-      <w:color w:val="4F81BD" w:themeColor="accent1"/>
+      <w:color w:val="374151"/>
+      <w:sz w:val="23"/>
     </w:rPr>
   </w:style>
   <w:style w:type="paragraph" w:styleId="Heading4">

</xml_diff>

<commit_message>
feat: add admin dashboard and management APIs
</commit_message>
<xml_diff>
--- a/村超MiniApp产品PRD.docx
+++ b/村超MiniApp产品PRD.docx
@@ -11353,6 +11353,1688 @@
       </w:tr>
     </w:tbl>
     <w:p/>
+    <w:p>
+      <w:r>
+        <w:br w:type="page"/>
+      </w:r>
+    </w:p>
+    <w:p>
+      <w:pPr>
+        <w:pStyle w:val="Heading1"/>
+      </w:pPr>
+      <w:r>
+        <w:t>17. 2026-06-16 管理后台与后端能力补充</w:t>
+      </w:r>
+    </w:p>
+    <w:p>
+      <w:r>
+        <w:t>本轮新增运营管理后台，用于支撑资讯/赛事类产品的日常运营、数据审核和增长看板。后台首版已接入 H5 /admin 路径，并新增管理后端接口和 Vercel serverless 接口。详细后端 PRD 见 docs/admin-backend-prd.md。</w:t>
+      </w:r>
+    </w:p>
+    <w:p>
+      <w:pPr>
+        <w:pStyle w:val="Heading2"/>
+      </w:pPr>
+      <w:r>
+        <w:t>17.1 后台模块</w:t>
+      </w:r>
+    </w:p>
+    <w:tbl>
+      <w:tblPr>
+        <w:tblStyle w:val="TableGrid"/>
+        <w:tblW w:type="auto" w:w="0"/>
+        <w:tblLook w:firstColumn="1" w:firstRow="1" w:lastColumn="0" w:lastRow="0" w:noHBand="0" w:noVBand="1" w:val="04A0"/>
+      </w:tblPr>
+      <w:tblGrid>
+        <w:gridCol w:w="3293"/>
+        <w:gridCol w:w="3293"/>
+        <w:gridCol w:w="3293"/>
+      </w:tblGrid>
+      <w:tr>
+        <w:tc>
+          <w:tcPr>
+            <w:tcW w:type="dxa" w:w="3293"/>
+          </w:tcPr>
+          <w:p>
+            <w:r/>
+            <w:r>
+              <w:rPr>
+                <w:rFonts w:ascii="Arial" w:hAnsi="Arial"/>
+                <w:b/>
+                <w:sz w:val="18"/>
+              </w:rPr>
+              <w:t>模块</w:t>
+            </w:r>
+          </w:p>
+        </w:tc>
+        <w:tc>
+          <w:tcPr>
+            <w:tcW w:type="dxa" w:w="3293"/>
+          </w:tcPr>
+          <w:p>
+            <w:r/>
+            <w:r>
+              <w:rPr>
+                <w:rFonts w:ascii="Arial" w:hAnsi="Arial"/>
+                <w:b/>
+                <w:sz w:val="18"/>
+              </w:rPr>
+              <w:t>首版能力</w:t>
+            </w:r>
+          </w:p>
+        </w:tc>
+        <w:tc>
+          <w:tcPr>
+            <w:tcW w:type="dxa" w:w="3293"/>
+          </w:tcPr>
+          <w:p>
+            <w:r/>
+            <w:r>
+              <w:rPr>
+                <w:rFonts w:ascii="Arial" w:hAnsi="Arial"/>
+                <w:b/>
+                <w:sz w:val="18"/>
+              </w:rPr>
+              <w:t>后续生产化</w:t>
+            </w:r>
+          </w:p>
+        </w:tc>
+      </w:tr>
+      <w:tr>
+        <w:tc>
+          <w:tcPr>
+            <w:tcW w:type="dxa" w:w="3293"/>
+          </w:tcPr>
+          <w:p>
+            <w:r/>
+            <w:r>
+              <w:rPr>
+                <w:rFonts w:ascii="Arial" w:hAnsi="Arial"/>
+                <w:b w:val="0"/>
+                <w:sz w:val="18"/>
+              </w:rPr>
+              <w:t>总览</w:t>
+            </w:r>
+          </w:p>
+        </w:tc>
+        <w:tc>
+          <w:tcPr>
+            <w:tcW w:type="dxa" w:w="3293"/>
+          </w:tcPr>
+          <w:p>
+            <w:r/>
+            <w:r>
+              <w:rPr>
+                <w:rFonts w:ascii="Arial" w:hAnsi="Arial"/>
+                <w:b w:val="0"/>
+                <w:sz w:val="18"/>
+              </w:rPr>
+              <w:t>DAU、平均观看时长、资讯 CTR、预约转化、内容池规模、模块健康度。</w:t>
+            </w:r>
+          </w:p>
+        </w:tc>
+        <w:tc>
+          <w:tcPr>
+            <w:tcW w:type="dxa" w:w="3293"/>
+          </w:tcPr>
+          <w:p>
+            <w:r/>
+            <w:r>
+              <w:rPr>
+                <w:rFonts w:ascii="Arial" w:hAnsi="Arial"/>
+                <w:b w:val="0"/>
+                <w:sz w:val="18"/>
+              </w:rPr>
+              <w:t>接真实埋点仓库、告警和运营日报。</w:t>
+            </w:r>
+          </w:p>
+        </w:tc>
+      </w:tr>
+      <w:tr>
+        <w:tc>
+          <w:tcPr>
+            <w:tcW w:type="dxa" w:w="3293"/>
+          </w:tcPr>
+          <w:p>
+            <w:r/>
+            <w:r>
+              <w:rPr>
+                <w:rFonts w:ascii="Arial" w:hAnsi="Arial"/>
+                <w:b w:val="0"/>
+                <w:sz w:val="18"/>
+              </w:rPr>
+              <w:t>内容上新</w:t>
+            </w:r>
+          </w:p>
+        </w:tc>
+        <w:tc>
+          <w:tcPr>
+            <w:tcW w:type="dxa" w:w="3293"/>
+          </w:tcPr>
+          <w:p>
+            <w:r/>
+            <w:r>
+              <w:rPr>
+                <w:rFonts w:ascii="Arial" w:hAnsi="Arial"/>
+                <w:b w:val="0"/>
+                <w:sz w:val="18"/>
+              </w:rPr>
+              <w:t>新建资讯/视频/战报/攻略/公告草稿，查看审核队列。</w:t>
+            </w:r>
+          </w:p>
+        </w:tc>
+        <w:tc>
+          <w:tcPr>
+            <w:tcW w:type="dxa" w:w="3293"/>
+          </w:tcPr>
+          <w:p>
+            <w:r/>
+            <w:r>
+              <w:rPr>
+                <w:rFonts w:ascii="Arial" w:hAnsi="Arial"/>
+                <w:b w:val="0"/>
+                <w:sz w:val="18"/>
+              </w:rPr>
+              <w:t>CMS 富文本、图片上传、定时发布、版本回滚。</w:t>
+            </w:r>
+          </w:p>
+        </w:tc>
+      </w:tr>
+      <w:tr>
+        <w:tc>
+          <w:tcPr>
+            <w:tcW w:type="dxa" w:w="3293"/>
+          </w:tcPr>
+          <w:p>
+            <w:r/>
+            <w:r>
+              <w:rPr>
+                <w:rFonts w:ascii="Arial" w:hAnsi="Arial"/>
+                <w:b w:val="0"/>
+                <w:sz w:val="18"/>
+              </w:rPr>
+              <w:t>赛事管理</w:t>
+            </w:r>
+          </w:p>
+        </w:tc>
+        <w:tc>
+          <w:tcPr>
+            <w:tcW w:type="dxa" w:w="3293"/>
+          </w:tcPr>
+          <w:p>
+            <w:r/>
+            <w:r>
+              <w:rPr>
+                <w:rFonts w:ascii="Arial" w:hAnsi="Arial"/>
+                <w:b w:val="0"/>
+                <w:sz w:val="18"/>
+              </w:rPr>
+              <w:t>未来比赛核验、赛程数据结构、比分事件规划。</w:t>
+            </w:r>
+          </w:p>
+        </w:tc>
+        <w:tc>
+          <w:tcPr>
+            <w:tcW w:type="dxa" w:w="3293"/>
+          </w:tcPr>
+          <w:p>
+            <w:r/>
+            <w:r>
+              <w:rPr>
+                <w:rFonts w:ascii="Arial" w:hAnsi="Arial"/>
+                <w:b w:val="0"/>
+                <w:sz w:val="18"/>
+              </w:rPr>
+              <w:t>官方数据导入、比分录入、积分榜计算。</w:t>
+            </w:r>
+          </w:p>
+        </w:tc>
+      </w:tr>
+      <w:tr>
+        <w:tc>
+          <w:tcPr>
+            <w:tcW w:type="dxa" w:w="3293"/>
+          </w:tcPr>
+          <w:p>
+            <w:r/>
+            <w:r>
+              <w:rPr>
+                <w:rFonts w:ascii="Arial" w:hAnsi="Arial"/>
+                <w:b w:val="0"/>
+                <w:sz w:val="18"/>
+              </w:rPr>
+              <w:t>球队球员</w:t>
+            </w:r>
+          </w:p>
+        </w:tc>
+        <w:tc>
+          <w:tcPr>
+            <w:tcW w:type="dxa" w:w="3293"/>
+          </w:tcPr>
+          <w:p>
+            <w:r/>
+            <w:r>
+              <w:rPr>
+                <w:rFonts w:ascii="Arial" w:hAnsi="Arial"/>
+                <w:b w:val="0"/>
+                <w:sz w:val="18"/>
+              </w:rPr>
+              <w:t>球队资料、球员字段、球队管理员认领规划。</w:t>
+            </w:r>
+          </w:p>
+        </w:tc>
+        <w:tc>
+          <w:tcPr>
+            <w:tcW w:type="dxa" w:w="3293"/>
+          </w:tcPr>
+          <w:p>
+            <w:r/>
+            <w:r>
+              <w:rPr>
+                <w:rFonts w:ascii="Arial" w:hAnsi="Arial"/>
+                <w:b w:val="0"/>
+                <w:sz w:val="18"/>
+              </w:rPr>
+              <w:t>授权资料库、纠错流程、敏感信息保护。</w:t>
+            </w:r>
+          </w:p>
+        </w:tc>
+      </w:tr>
+      <w:tr>
+        <w:tc>
+          <w:tcPr>
+            <w:tcW w:type="dxa" w:w="3293"/>
+          </w:tcPr>
+          <w:p>
+            <w:r/>
+            <w:r>
+              <w:rPr>
+                <w:rFonts w:ascii="Arial" w:hAnsi="Arial"/>
+                <w:b w:val="0"/>
+                <w:sz w:val="18"/>
+              </w:rPr>
+              <w:t>文旅攻略</w:t>
+            </w:r>
+          </w:p>
+        </w:tc>
+        <w:tc>
+          <w:tcPr>
+            <w:tcW w:type="dxa" w:w="3293"/>
+          </w:tcPr>
+          <w:p>
+            <w:r/>
+            <w:r>
+              <w:rPr>
+                <w:rFonts w:ascii="Arial" w:hAnsi="Arial"/>
+                <w:b w:val="0"/>
+                <w:sz w:val="18"/>
+              </w:rPr>
+              <w:t>按未来比赛匹配村寨攻略、住宿餐饮、图片素材。</w:t>
+            </w:r>
+          </w:p>
+        </w:tc>
+        <w:tc>
+          <w:tcPr>
+            <w:tcW w:type="dxa" w:w="3293"/>
+          </w:tcPr>
+          <w:p>
+            <w:r/>
+            <w:r>
+              <w:rPr>
+                <w:rFonts w:ascii="Arial" w:hAnsi="Arial"/>
+                <w:b w:val="0"/>
+                <w:sz w:val="18"/>
+              </w:rPr>
+              <w:t>商户后台、路线编辑、攻略复用和版权管理。</w:t>
+            </w:r>
+          </w:p>
+        </w:tc>
+      </w:tr>
+      <w:tr>
+        <w:tc>
+          <w:tcPr>
+            <w:tcW w:type="dxa" w:w="3293"/>
+          </w:tcPr>
+          <w:p>
+            <w:r/>
+            <w:r>
+              <w:rPr>
+                <w:rFonts w:ascii="Arial" w:hAnsi="Arial"/>
+                <w:b w:val="0"/>
+                <w:sz w:val="18"/>
+              </w:rPr>
+              <w:t>社区审核</w:t>
+            </w:r>
+          </w:p>
+        </w:tc>
+        <w:tc>
+          <w:tcPr>
+            <w:tcW w:type="dxa" w:w="3293"/>
+          </w:tcPr>
+          <w:p>
+            <w:r/>
+            <w:r>
+              <w:rPr>
+                <w:rFonts w:ascii="Arial" w:hAnsi="Arial"/>
+                <w:b w:val="0"/>
+                <w:sz w:val="18"/>
+              </w:rPr>
+              <w:t>帖子评论巡检、治理能力清单。</w:t>
+            </w:r>
+          </w:p>
+        </w:tc>
+        <w:tc>
+          <w:tcPr>
+            <w:tcW w:type="dxa" w:w="3293"/>
+          </w:tcPr>
+          <w:p>
+            <w:r/>
+            <w:r>
+              <w:rPr>
+                <w:rFonts w:ascii="Arial" w:hAnsi="Arial"/>
+                <w:b w:val="0"/>
+                <w:sz w:val="18"/>
+              </w:rPr>
+              <w:t>敏感词、举报工单、禁言、删除、置顶和精选。</w:t>
+            </w:r>
+          </w:p>
+        </w:tc>
+      </w:tr>
+      <w:tr>
+        <w:tc>
+          <w:tcPr>
+            <w:tcW w:type="dxa" w:w="3293"/>
+          </w:tcPr>
+          <w:p>
+            <w:r/>
+            <w:r>
+              <w:rPr>
+                <w:rFonts w:ascii="Arial" w:hAnsi="Arial"/>
+                <w:b w:val="0"/>
+                <w:sz w:val="18"/>
+              </w:rPr>
+              <w:t>数据看板</w:t>
+            </w:r>
+          </w:p>
+        </w:tc>
+        <w:tc>
+          <w:tcPr>
+            <w:tcW w:type="dxa" w:w="3293"/>
+          </w:tcPr>
+          <w:p>
+            <w:r/>
+            <w:r>
+              <w:rPr>
+                <w:rFonts w:ascii="Arial" w:hAnsi="Arial"/>
+                <w:b w:val="0"/>
+                <w:sz w:val="18"/>
+              </w:rPr>
+              <w:t>页面 PV、平均时长、CTR、预约漏斗、事件字典。</w:t>
+            </w:r>
+          </w:p>
+        </w:tc>
+        <w:tc>
+          <w:tcPr>
+            <w:tcW w:type="dxa" w:w="3293"/>
+          </w:tcPr>
+          <w:p>
+            <w:r/>
+            <w:r>
+              <w:rPr>
+                <w:rFonts w:ascii="Arial" w:hAnsi="Arial"/>
+                <w:b w:val="0"/>
+                <w:sz w:val="18"/>
+              </w:rPr>
+              <w:t>PostHog/ClickHouse/数据仓库。</w:t>
+            </w:r>
+          </w:p>
+        </w:tc>
+      </w:tr>
+      <w:tr>
+        <w:tc>
+          <w:tcPr>
+            <w:tcW w:type="dxa" w:w="3293"/>
+          </w:tcPr>
+          <w:p>
+            <w:r/>
+            <w:r>
+              <w:rPr>
+                <w:rFonts w:ascii="Arial" w:hAnsi="Arial"/>
+                <w:b w:val="0"/>
+                <w:sz w:val="18"/>
+              </w:rPr>
+              <w:t>系统设置</w:t>
+            </w:r>
+          </w:p>
+        </w:tc>
+        <w:tc>
+          <w:tcPr>
+            <w:tcW w:type="dxa" w:w="3293"/>
+          </w:tcPr>
+          <w:p>
+            <w:r/>
+            <w:r>
+              <w:rPr>
+                <w:rFonts w:ascii="Arial" w:hAnsi="Arial"/>
+                <w:b w:val="0"/>
+                <w:sz w:val="18"/>
+              </w:rPr>
+              <w:t>角色权限、数据源、发布流、审计日志规划。</w:t>
+            </w:r>
+          </w:p>
+        </w:tc>
+        <w:tc>
+          <w:tcPr>
+            <w:tcW w:type="dxa" w:w="3293"/>
+          </w:tcPr>
+          <w:p>
+            <w:r/>
+            <w:r>
+              <w:rPr>
+                <w:rFonts w:ascii="Arial" w:hAnsi="Arial"/>
+                <w:b w:val="0"/>
+                <w:sz w:val="18"/>
+              </w:rPr>
+              <w:t>RBAC、API 密钥、灰度发布。</w:t>
+            </w:r>
+          </w:p>
+        </w:tc>
+      </w:tr>
+    </w:tbl>
+    <w:p/>
+    <w:p>
+      <w:pPr>
+        <w:pStyle w:val="Heading2"/>
+      </w:pPr>
+      <w:r>
+        <w:t>17.2 内容生产板块</w:t>
+      </w:r>
+    </w:p>
+    <w:tbl>
+      <w:tblPr>
+        <w:tblStyle w:val="TableGrid"/>
+        <w:tblW w:type="auto" w:w="0"/>
+        <w:tblLook w:firstColumn="1" w:firstRow="1" w:lastColumn="0" w:lastRow="0" w:noHBand="0" w:noVBand="1" w:val="04A0"/>
+      </w:tblPr>
+      <w:tblGrid>
+        <w:gridCol w:w="3293"/>
+        <w:gridCol w:w="3293"/>
+        <w:gridCol w:w="3293"/>
+      </w:tblGrid>
+      <w:tr>
+        <w:tc>
+          <w:tcPr>
+            <w:tcW w:type="dxa" w:w="3293"/>
+          </w:tcPr>
+          <w:p>
+            <w:r/>
+            <w:r>
+              <w:rPr>
+                <w:rFonts w:ascii="Arial" w:hAnsi="Arial"/>
+                <w:b/>
+                <w:sz w:val="18"/>
+              </w:rPr>
+              <w:t>内容类型</w:t>
+            </w:r>
+          </w:p>
+        </w:tc>
+        <w:tc>
+          <w:tcPr>
+            <w:tcW w:type="dxa" w:w="3293"/>
+          </w:tcPr>
+          <w:p>
+            <w:r/>
+            <w:r>
+              <w:rPr>
+                <w:rFonts w:ascii="Arial" w:hAnsi="Arial"/>
+                <w:b/>
+                <w:sz w:val="18"/>
+              </w:rPr>
+              <w:t>前台分发位置</w:t>
+            </w:r>
+          </w:p>
+        </w:tc>
+        <w:tc>
+          <w:tcPr>
+            <w:tcW w:type="dxa" w:w="3293"/>
+          </w:tcPr>
+          <w:p>
+            <w:r/>
+            <w:r>
+              <w:rPr>
+                <w:rFonts w:ascii="Arial" w:hAnsi="Arial"/>
+                <w:b/>
+                <w:sz w:val="18"/>
+              </w:rPr>
+              <w:t>关键字段</w:t>
+            </w:r>
+          </w:p>
+        </w:tc>
+      </w:tr>
+      <w:tr>
+        <w:tc>
+          <w:tcPr>
+            <w:tcW w:type="dxa" w:w="3293"/>
+          </w:tcPr>
+          <w:p>
+            <w:r/>
+            <w:r>
+              <w:rPr>
+                <w:rFonts w:ascii="Arial" w:hAnsi="Arial"/>
+                <w:b w:val="0"/>
+                <w:sz w:val="18"/>
+              </w:rPr>
+              <w:t>快讯/新闻</w:t>
+            </w:r>
+          </w:p>
+        </w:tc>
+        <w:tc>
+          <w:tcPr>
+            <w:tcW w:type="dxa" w:w="3293"/>
+          </w:tcPr>
+          <w:p>
+            <w:r/>
+            <w:r>
+              <w:rPr>
+                <w:rFonts w:ascii="Arial" w:hAnsi="Arial"/>
+                <w:b w:val="0"/>
+                <w:sz w:val="18"/>
+              </w:rPr>
+              <w:t>首页信息流、资讯详情</w:t>
+            </w:r>
+          </w:p>
+        </w:tc>
+        <w:tc>
+          <w:tcPr>
+            <w:tcW w:type="dxa" w:w="3293"/>
+          </w:tcPr>
+          <w:p>
+            <w:r/>
+            <w:r>
+              <w:rPr>
+                <w:rFonts w:ascii="Arial" w:hAnsi="Arial"/>
+                <w:b w:val="0"/>
+                <w:sz w:val="18"/>
+              </w:rPr>
+              <w:t>标题、摘要、正文、封面图、来源、发布时间、原文链接。</w:t>
+            </w:r>
+          </w:p>
+        </w:tc>
+      </w:tr>
+      <w:tr>
+        <w:tc>
+          <w:tcPr>
+            <w:tcW w:type="dxa" w:w="3293"/>
+          </w:tcPr>
+          <w:p>
+            <w:r/>
+            <w:r>
+              <w:rPr>
+                <w:rFonts w:ascii="Arial" w:hAnsi="Arial"/>
+                <w:b w:val="0"/>
+                <w:sz w:val="18"/>
+              </w:rPr>
+              <w:t>赛前前瞻</w:t>
+            </w:r>
+          </w:p>
+        </w:tc>
+        <w:tc>
+          <w:tcPr>
+            <w:tcW w:type="dxa" w:w="3293"/>
+          </w:tcPr>
+          <w:p>
+            <w:r/>
+            <w:r>
+              <w:rPr>
+                <w:rFonts w:ascii="Arial" w:hAnsi="Arial"/>
+                <w:b w:val="0"/>
+                <w:sz w:val="18"/>
+              </w:rPr>
+              <w:t>首页、赛事页、比赛详情</w:t>
+            </w:r>
+          </w:p>
+        </w:tc>
+        <w:tc>
+          <w:tcPr>
+            <w:tcW w:type="dxa" w:w="3293"/>
+          </w:tcPr>
+          <w:p>
+            <w:r/>
+            <w:r>
+              <w:rPr>
+                <w:rFonts w:ascii="Arial" w:hAnsi="Arial"/>
+                <w:b w:val="0"/>
+                <w:sz w:val="18"/>
+              </w:rPr>
+              <w:t>对阵、看点、双方近况、预约说明。</w:t>
+            </w:r>
+          </w:p>
+        </w:tc>
+      </w:tr>
+      <w:tr>
+        <w:tc>
+          <w:tcPr>
+            <w:tcW w:type="dxa" w:w="3293"/>
+          </w:tcPr>
+          <w:p>
+            <w:r/>
+            <w:r>
+              <w:rPr>
+                <w:rFonts w:ascii="Arial" w:hAnsi="Arial"/>
+                <w:b w:val="0"/>
+                <w:sz w:val="18"/>
+              </w:rPr>
+              <w:t>赛后战报</w:t>
+            </w:r>
+          </w:p>
+        </w:tc>
+        <w:tc>
+          <w:tcPr>
+            <w:tcW w:type="dxa" w:w="3293"/>
+          </w:tcPr>
+          <w:p>
+            <w:r/>
+            <w:r>
+              <w:rPr>
+                <w:rFonts w:ascii="Arial" w:hAnsi="Arial"/>
+                <w:b w:val="0"/>
+                <w:sz w:val="18"/>
+              </w:rPr>
+              <w:t>首页、比赛详情、球队页</w:t>
+            </w:r>
+          </w:p>
+        </w:tc>
+        <w:tc>
+          <w:tcPr>
+            <w:tcW w:type="dxa" w:w="3293"/>
+          </w:tcPr>
+          <w:p>
+            <w:r/>
+            <w:r>
+              <w:rPr>
+                <w:rFonts w:ascii="Arial" w:hAnsi="Arial"/>
+                <w:b w:val="0"/>
+                <w:sz w:val="18"/>
+              </w:rPr>
+              <w:t>比分、关键事件、最佳球员、评论热度。</w:t>
+            </w:r>
+          </w:p>
+        </w:tc>
+      </w:tr>
+      <w:tr>
+        <w:tc>
+          <w:tcPr>
+            <w:tcW w:type="dxa" w:w="3293"/>
+          </w:tcPr>
+          <w:p>
+            <w:r/>
+            <w:r>
+              <w:rPr>
+                <w:rFonts w:ascii="Arial" w:hAnsi="Arial"/>
+                <w:b w:val="0"/>
+                <w:sz w:val="18"/>
+              </w:rPr>
+              <w:t>视频/图集</w:t>
+            </w:r>
+          </w:p>
+        </w:tc>
+        <w:tc>
+          <w:tcPr>
+            <w:tcW w:type="dxa" w:w="3293"/>
+          </w:tcPr>
+          <w:p>
+            <w:r/>
+            <w:r>
+              <w:rPr>
+                <w:rFonts w:ascii="Arial" w:hAnsi="Arial"/>
+                <w:b w:val="0"/>
+                <w:sz w:val="18"/>
+              </w:rPr>
+              <w:t>首页、资讯详情、球队页</w:t>
+            </w:r>
+          </w:p>
+        </w:tc>
+        <w:tc>
+          <w:tcPr>
+            <w:tcW w:type="dxa" w:w="3293"/>
+          </w:tcPr>
+          <w:p>
+            <w:r/>
+            <w:r>
+              <w:rPr>
+                <w:rFonts w:ascii="Arial" w:hAnsi="Arial"/>
+                <w:b w:val="0"/>
+                <w:sz w:val="18"/>
+              </w:rPr>
+              <w:t>封面、视频/图集地址、版权说明。</w:t>
+            </w:r>
+          </w:p>
+        </w:tc>
+      </w:tr>
+      <w:tr>
+        <w:tc>
+          <w:tcPr>
+            <w:tcW w:type="dxa" w:w="3293"/>
+          </w:tcPr>
+          <w:p>
+            <w:r/>
+            <w:r>
+              <w:rPr>
+                <w:rFonts w:ascii="Arial" w:hAnsi="Arial"/>
+                <w:b w:val="0"/>
+                <w:sz w:val="18"/>
+              </w:rPr>
+              <w:t>球队故事</w:t>
+            </w:r>
+          </w:p>
+        </w:tc>
+        <w:tc>
+          <w:tcPr>
+            <w:tcW w:type="dxa" w:w="3293"/>
+          </w:tcPr>
+          <w:p>
+            <w:r/>
+            <w:r>
+              <w:rPr>
+                <w:rFonts w:ascii="Arial" w:hAnsi="Arial"/>
+                <w:b w:val="0"/>
+                <w:sz w:val="18"/>
+              </w:rPr>
+              <w:t>球队页、首页专题</w:t>
+            </w:r>
+          </w:p>
+        </w:tc>
+        <w:tc>
+          <w:tcPr>
+            <w:tcW w:type="dxa" w:w="3293"/>
+          </w:tcPr>
+          <w:p>
+            <w:r/>
+            <w:r>
+              <w:rPr>
+                <w:rFonts w:ascii="Arial" w:hAnsi="Arial"/>
+                <w:b w:val="0"/>
+                <w:sz w:val="18"/>
+              </w:rPr>
+              <w:t>村寨故事、球队历史、荣誉、人物。</w:t>
+            </w:r>
+          </w:p>
+        </w:tc>
+      </w:tr>
+      <w:tr>
+        <w:tc>
+          <w:tcPr>
+            <w:tcW w:type="dxa" w:w="3293"/>
+          </w:tcPr>
+          <w:p>
+            <w:r/>
+            <w:r>
+              <w:rPr>
+                <w:rFonts w:ascii="Arial" w:hAnsi="Arial"/>
+                <w:b w:val="0"/>
+                <w:sz w:val="18"/>
+              </w:rPr>
+              <w:t>文旅攻略</w:t>
+            </w:r>
+          </w:p>
+        </w:tc>
+        <w:tc>
+          <w:tcPr>
+            <w:tcW w:type="dxa" w:w="3293"/>
+          </w:tcPr>
+          <w:p>
+            <w:r/>
+            <w:r>
+              <w:rPr>
+                <w:rFonts w:ascii="Arial" w:hAnsi="Arial"/>
+                <w:b w:val="0"/>
+                <w:sz w:val="18"/>
+              </w:rPr>
+              <w:t>文旅页、比赛详情</w:t>
+            </w:r>
+          </w:p>
+        </w:tc>
+        <w:tc>
+          <w:tcPr>
+            <w:tcW w:type="dxa" w:w="3293"/>
+          </w:tcPr>
+          <w:p>
+            <w:r/>
+            <w:r>
+              <w:rPr>
+                <w:rFonts w:ascii="Arial" w:hAnsi="Arial"/>
+                <w:b w:val="0"/>
+                <w:sz w:val="18"/>
+              </w:rPr>
+              <w:t>村寨介绍、路线、住宿、餐饮、交通、图片来源。</w:t>
+            </w:r>
+          </w:p>
+        </w:tc>
+      </w:tr>
+      <w:tr>
+        <w:tc>
+          <w:tcPr>
+            <w:tcW w:type="dxa" w:w="3293"/>
+          </w:tcPr>
+          <w:p>
+            <w:r/>
+            <w:r>
+              <w:rPr>
+                <w:rFonts w:ascii="Arial" w:hAnsi="Arial"/>
+                <w:b w:val="0"/>
+                <w:sz w:val="18"/>
+              </w:rPr>
+              <w:t>官方公告</w:t>
+            </w:r>
+          </w:p>
+        </w:tc>
+        <w:tc>
+          <w:tcPr>
+            <w:tcW w:type="dxa" w:w="3293"/>
+          </w:tcPr>
+          <w:p>
+            <w:r/>
+            <w:r>
+              <w:rPr>
+                <w:rFonts w:ascii="Arial" w:hAnsi="Arial"/>
+                <w:b w:val="0"/>
+                <w:sz w:val="18"/>
+              </w:rPr>
+              <w:t>首页、赛事页</w:t>
+            </w:r>
+          </w:p>
+        </w:tc>
+        <w:tc>
+          <w:tcPr>
+            <w:tcW w:type="dxa" w:w="3293"/>
+          </w:tcPr>
+          <w:p>
+            <w:r/>
+            <w:r>
+              <w:rPr>
+                <w:rFonts w:ascii="Arial" w:hAnsi="Arial"/>
+                <w:b w:val="0"/>
+                <w:sz w:val="18"/>
+              </w:rPr>
+              <w:t>正文、有效期、发布单位。</w:t>
+            </w:r>
+          </w:p>
+        </w:tc>
+      </w:tr>
+      <w:tr>
+        <w:tc>
+          <w:tcPr>
+            <w:tcW w:type="dxa" w:w="3293"/>
+          </w:tcPr>
+          <w:p>
+            <w:r/>
+            <w:r>
+              <w:rPr>
+                <w:rFonts w:ascii="Arial" w:hAnsi="Arial"/>
+                <w:b w:val="0"/>
+                <w:sz w:val="18"/>
+              </w:rPr>
+              <w:t>社区精选</w:t>
+            </w:r>
+          </w:p>
+        </w:tc>
+        <w:tc>
+          <w:tcPr>
+            <w:tcW w:type="dxa" w:w="3293"/>
+          </w:tcPr>
+          <w:p>
+            <w:r/>
+            <w:r>
+              <w:rPr>
+                <w:rFonts w:ascii="Arial" w:hAnsi="Arial"/>
+                <w:b w:val="0"/>
+                <w:sz w:val="18"/>
+              </w:rPr>
+              <w:t>社区、首页热帖</w:t>
+            </w:r>
+          </w:p>
+        </w:tc>
+        <w:tc>
+          <w:tcPr>
+            <w:tcW w:type="dxa" w:w="3293"/>
+          </w:tcPr>
+          <w:p>
+            <w:r/>
+            <w:r>
+              <w:rPr>
+                <w:rFonts w:ascii="Arial" w:hAnsi="Arial"/>
+                <w:b w:val="0"/>
+                <w:sz w:val="18"/>
+              </w:rPr>
+              <w:t>帖子、作者、精选理由、审核状态。</w:t>
+            </w:r>
+          </w:p>
+        </w:tc>
+      </w:tr>
+    </w:tbl>
+    <w:p/>
+    <w:p>
+      <w:pPr>
+        <w:pStyle w:val="Heading2"/>
+      </w:pPr>
+      <w:r>
+        <w:t>17.3 后端接口与埋点</w:t>
+      </w:r>
+    </w:p>
+    <w:tbl>
+      <w:tblPr>
+        <w:tblStyle w:val="TableGrid"/>
+        <w:tblW w:type="auto" w:w="0"/>
+        <w:tblLook w:firstColumn="1" w:firstRow="1" w:lastColumn="0" w:lastRow="0" w:noHBand="0" w:noVBand="1" w:val="04A0"/>
+      </w:tblPr>
+      <w:tblGrid>
+        <w:gridCol w:w="2469"/>
+        <w:gridCol w:w="2469"/>
+        <w:gridCol w:w="2469"/>
+        <w:gridCol w:w="2469"/>
+      </w:tblGrid>
+      <w:tr>
+        <w:tc>
+          <w:tcPr>
+            <w:tcW w:type="dxa" w:w="2469"/>
+          </w:tcPr>
+          <w:p>
+            <w:r/>
+            <w:r>
+              <w:rPr>
+                <w:rFonts w:ascii="Arial" w:hAnsi="Arial"/>
+                <w:b/>
+                <w:sz w:val="18"/>
+              </w:rPr>
+              <w:t>接口/事件</w:t>
+            </w:r>
+          </w:p>
+        </w:tc>
+        <w:tc>
+          <w:tcPr>
+            <w:tcW w:type="dxa" w:w="2469"/>
+          </w:tcPr>
+          <w:p>
+            <w:r/>
+            <w:r>
+              <w:rPr>
+                <w:rFonts w:ascii="Arial" w:hAnsi="Arial"/>
+                <w:b/>
+                <w:sz w:val="18"/>
+              </w:rPr>
+              <w:t>类型</w:t>
+            </w:r>
+          </w:p>
+        </w:tc>
+        <w:tc>
+          <w:tcPr>
+            <w:tcW w:type="dxa" w:w="2469"/>
+          </w:tcPr>
+          <w:p>
+            <w:r/>
+            <w:r>
+              <w:rPr>
+                <w:rFonts w:ascii="Arial" w:hAnsi="Arial"/>
+                <w:b/>
+                <w:sz w:val="18"/>
+              </w:rPr>
+              <w:t>用途</w:t>
+            </w:r>
+          </w:p>
+        </w:tc>
+        <w:tc>
+          <w:tcPr>
+            <w:tcW w:type="dxa" w:w="2469"/>
+          </w:tcPr>
+          <w:p>
+            <w:r/>
+            <w:r>
+              <w:rPr>
+                <w:rFonts w:ascii="Arial" w:hAnsi="Arial"/>
+                <w:b/>
+                <w:sz w:val="18"/>
+              </w:rPr>
+              <w:t>当前状态</w:t>
+            </w:r>
+          </w:p>
+        </w:tc>
+      </w:tr>
+      <w:tr>
+        <w:tc>
+          <w:tcPr>
+            <w:tcW w:type="dxa" w:w="2469"/>
+          </w:tcPr>
+          <w:p>
+            <w:r/>
+            <w:r>
+              <w:rPr>
+                <w:rFonts w:ascii="Arial" w:hAnsi="Arial"/>
+                <w:b w:val="0"/>
+                <w:sz w:val="18"/>
+              </w:rPr>
+              <w:t>/api/admin/overview</w:t>
+            </w:r>
+          </w:p>
+        </w:tc>
+        <w:tc>
+          <w:tcPr>
+            <w:tcW w:type="dxa" w:w="2469"/>
+          </w:tcPr>
+          <w:p>
+            <w:r/>
+            <w:r>
+              <w:rPr>
+                <w:rFonts w:ascii="Arial" w:hAnsi="Arial"/>
+                <w:b w:val="0"/>
+                <w:sz w:val="18"/>
+              </w:rPr>
+              <w:t>GET</w:t>
+            </w:r>
+          </w:p>
+        </w:tc>
+        <w:tc>
+          <w:tcPr>
+            <w:tcW w:type="dxa" w:w="2469"/>
+          </w:tcPr>
+          <w:p>
+            <w:r/>
+            <w:r>
+              <w:rPr>
+                <w:rFonts w:ascii="Arial" w:hAnsi="Arial"/>
+                <w:b w:val="0"/>
+                <w:sz w:val="18"/>
+              </w:rPr>
+              <w:t>后台总览、模块健康度、漏斗、事件字典。</w:t>
+            </w:r>
+          </w:p>
+        </w:tc>
+        <w:tc>
+          <w:tcPr>
+            <w:tcW w:type="dxa" w:w="2469"/>
+          </w:tcPr>
+          <w:p>
+            <w:r/>
+            <w:r>
+              <w:rPr>
+                <w:rFonts w:ascii="Arial" w:hAnsi="Arial"/>
+                <w:b w:val="0"/>
+                <w:sz w:val="18"/>
+              </w:rPr>
+              <w:t>Fastify 与 Vercel serverless 已开发。</w:t>
+            </w:r>
+          </w:p>
+        </w:tc>
+      </w:tr>
+      <w:tr>
+        <w:tc>
+          <w:tcPr>
+            <w:tcW w:type="dxa" w:w="2469"/>
+          </w:tcPr>
+          <w:p>
+            <w:r/>
+            <w:r>
+              <w:rPr>
+                <w:rFonts w:ascii="Arial" w:hAnsi="Arial"/>
+                <w:b w:val="0"/>
+                <w:sz w:val="18"/>
+              </w:rPr>
+              <w:t>/api/admin/content/drafts</w:t>
+            </w:r>
+          </w:p>
+        </w:tc>
+        <w:tc>
+          <w:tcPr>
+            <w:tcW w:type="dxa" w:w="2469"/>
+          </w:tcPr>
+          <w:p>
+            <w:r/>
+            <w:r>
+              <w:rPr>
+                <w:rFonts w:ascii="Arial" w:hAnsi="Arial"/>
+                <w:b w:val="0"/>
+                <w:sz w:val="18"/>
+              </w:rPr>
+              <w:t>POST</w:t>
+            </w:r>
+          </w:p>
+        </w:tc>
+        <w:tc>
+          <w:tcPr>
+            <w:tcW w:type="dxa" w:w="2469"/>
+          </w:tcPr>
+          <w:p>
+            <w:r/>
+            <w:r>
+              <w:rPr>
+                <w:rFonts w:ascii="Arial" w:hAnsi="Arial"/>
+                <w:b w:val="0"/>
+                <w:sz w:val="18"/>
+              </w:rPr>
+              <w:t>创建内容草稿并进入审核队列。</w:t>
+            </w:r>
+          </w:p>
+        </w:tc>
+        <w:tc>
+          <w:tcPr>
+            <w:tcW w:type="dxa" w:w="2469"/>
+          </w:tcPr>
+          <w:p>
+            <w:r/>
+            <w:r>
+              <w:rPr>
+                <w:rFonts w:ascii="Arial" w:hAnsi="Arial"/>
+                <w:b w:val="0"/>
+                <w:sz w:val="18"/>
+              </w:rPr>
+              <w:t>Fastify 已开发，前端首版用 localStorage 草稿。</w:t>
+            </w:r>
+          </w:p>
+        </w:tc>
+      </w:tr>
+      <w:tr>
+        <w:tc>
+          <w:tcPr>
+            <w:tcW w:type="dxa" w:w="2469"/>
+          </w:tcPr>
+          <w:p>
+            <w:r/>
+            <w:r>
+              <w:rPr>
+                <w:rFonts w:ascii="Arial" w:hAnsi="Arial"/>
+                <w:b w:val="0"/>
+                <w:sz w:val="18"/>
+              </w:rPr>
+              <w:t>/api/analytics/events</w:t>
+            </w:r>
+          </w:p>
+        </w:tc>
+        <w:tc>
+          <w:tcPr>
+            <w:tcW w:type="dxa" w:w="2469"/>
+          </w:tcPr>
+          <w:p>
+            <w:r/>
+            <w:r>
+              <w:rPr>
+                <w:rFonts w:ascii="Arial" w:hAnsi="Arial"/>
+                <w:b w:val="0"/>
+                <w:sz w:val="18"/>
+              </w:rPr>
+              <w:t>POST</w:t>
+            </w:r>
+          </w:p>
+        </w:tc>
+        <w:tc>
+          <w:tcPr>
+            <w:tcW w:type="dxa" w:w="2469"/>
+          </w:tcPr>
+          <w:p>
+            <w:r/>
+            <w:r>
+              <w:rPr>
+                <w:rFonts w:ascii="Arial" w:hAnsi="Arial"/>
+                <w:b w:val="0"/>
+                <w:sz w:val="18"/>
+              </w:rPr>
+              <w:t>接收页面浏览、点击、预约、评论、收藏等事件。</w:t>
+            </w:r>
+          </w:p>
+        </w:tc>
+        <w:tc>
+          <w:tcPr>
+            <w:tcW w:type="dxa" w:w="2469"/>
+          </w:tcPr>
+          <w:p>
+            <w:r/>
+            <w:r>
+              <w:rPr>
+                <w:rFonts w:ascii="Arial" w:hAnsi="Arial"/>
+                <w:b w:val="0"/>
+                <w:sz w:val="18"/>
+              </w:rPr>
+              <w:t>Fastify 与 Vercel serverless 已开发。</w:t>
+            </w:r>
+          </w:p>
+        </w:tc>
+      </w:tr>
+      <w:tr>
+        <w:tc>
+          <w:tcPr>
+            <w:tcW w:type="dxa" w:w="2469"/>
+          </w:tcPr>
+          <w:p>
+            <w:r/>
+            <w:r>
+              <w:rPr>
+                <w:rFonts w:ascii="Arial" w:hAnsi="Arial"/>
+                <w:b w:val="0"/>
+                <w:sz w:val="18"/>
+              </w:rPr>
+              <w:t>page_view</w:t>
+            </w:r>
+          </w:p>
+        </w:tc>
+        <w:tc>
+          <w:tcPr>
+            <w:tcW w:type="dxa" w:w="2469"/>
+          </w:tcPr>
+          <w:p>
+            <w:r/>
+            <w:r>
+              <w:rPr>
+                <w:rFonts w:ascii="Arial" w:hAnsi="Arial"/>
+                <w:b w:val="0"/>
+                <w:sz w:val="18"/>
+              </w:rPr>
+              <w:t>埋点</w:t>
+            </w:r>
+          </w:p>
+        </w:tc>
+        <w:tc>
+          <w:tcPr>
+            <w:tcW w:type="dxa" w:w="2469"/>
+          </w:tcPr>
+          <w:p>
+            <w:r/>
+            <w:r>
+              <w:rPr>
+                <w:rFonts w:ascii="Arial" w:hAnsi="Arial"/>
+                <w:b w:val="0"/>
+                <w:sz w:val="18"/>
+              </w:rPr>
+              <w:t>DAU、路径分析、页面 PV。</w:t>
+            </w:r>
+          </w:p>
+        </w:tc>
+        <w:tc>
+          <w:tcPr>
+            <w:tcW w:type="dxa" w:w="2469"/>
+          </w:tcPr>
+          <w:p>
+            <w:r/>
+            <w:r>
+              <w:rPr>
+                <w:rFonts w:ascii="Arial" w:hAnsi="Arial"/>
+                <w:b w:val="0"/>
+                <w:sz w:val="18"/>
+              </w:rPr>
+              <w:t>事件字典已定义。</w:t>
+            </w:r>
+          </w:p>
+        </w:tc>
+      </w:tr>
+      <w:tr>
+        <w:tc>
+          <w:tcPr>
+            <w:tcW w:type="dxa" w:w="2469"/>
+          </w:tcPr>
+          <w:p>
+            <w:r/>
+            <w:r>
+              <w:rPr>
+                <w:rFonts w:ascii="Arial" w:hAnsi="Arial"/>
+                <w:b w:val="0"/>
+                <w:sz w:val="18"/>
+              </w:rPr>
+              <w:t>content_click</w:t>
+            </w:r>
+          </w:p>
+        </w:tc>
+        <w:tc>
+          <w:tcPr>
+            <w:tcW w:type="dxa" w:w="2469"/>
+          </w:tcPr>
+          <w:p>
+            <w:r/>
+            <w:r>
+              <w:rPr>
+                <w:rFonts w:ascii="Arial" w:hAnsi="Arial"/>
+                <w:b w:val="0"/>
+                <w:sz w:val="18"/>
+              </w:rPr>
+              <w:t>埋点</w:t>
+            </w:r>
+          </w:p>
+        </w:tc>
+        <w:tc>
+          <w:tcPr>
+            <w:tcW w:type="dxa" w:w="2469"/>
+          </w:tcPr>
+          <w:p>
+            <w:r/>
+            <w:r>
+              <w:rPr>
+                <w:rFonts w:ascii="Arial" w:hAnsi="Arial"/>
+                <w:b w:val="0"/>
+                <w:sz w:val="18"/>
+              </w:rPr>
+              <w:t>内容 CTR、推荐效果。</w:t>
+            </w:r>
+          </w:p>
+        </w:tc>
+        <w:tc>
+          <w:tcPr>
+            <w:tcW w:type="dxa" w:w="2469"/>
+          </w:tcPr>
+          <w:p>
+            <w:r/>
+            <w:r>
+              <w:rPr>
+                <w:rFonts w:ascii="Arial" w:hAnsi="Arial"/>
+                <w:b w:val="0"/>
+                <w:sz w:val="18"/>
+              </w:rPr>
+              <w:t>事件字典已定义。</w:t>
+            </w:r>
+          </w:p>
+        </w:tc>
+      </w:tr>
+      <w:tr>
+        <w:tc>
+          <w:tcPr>
+            <w:tcW w:type="dxa" w:w="2469"/>
+          </w:tcPr>
+          <w:p>
+            <w:r/>
+            <w:r>
+              <w:rPr>
+                <w:rFonts w:ascii="Arial" w:hAnsi="Arial"/>
+                <w:b w:val="0"/>
+                <w:sz w:val="18"/>
+              </w:rPr>
+              <w:t>match_click</w:t>
+            </w:r>
+          </w:p>
+        </w:tc>
+        <w:tc>
+          <w:tcPr>
+            <w:tcW w:type="dxa" w:w="2469"/>
+          </w:tcPr>
+          <w:p>
+            <w:r/>
+            <w:r>
+              <w:rPr>
+                <w:rFonts w:ascii="Arial" w:hAnsi="Arial"/>
+                <w:b w:val="0"/>
+                <w:sz w:val="18"/>
+              </w:rPr>
+              <w:t>埋点</w:t>
+            </w:r>
+          </w:p>
+        </w:tc>
+        <w:tc>
+          <w:tcPr>
+            <w:tcW w:type="dxa" w:w="2469"/>
+          </w:tcPr>
+          <w:p>
+            <w:r/>
+            <w:r>
+              <w:rPr>
+                <w:rFonts w:ascii="Arial" w:hAnsi="Arial"/>
+                <w:b w:val="0"/>
+                <w:sz w:val="18"/>
+              </w:rPr>
+              <w:t>赛事详情转化、热门比赛。</w:t>
+            </w:r>
+          </w:p>
+        </w:tc>
+        <w:tc>
+          <w:tcPr>
+            <w:tcW w:type="dxa" w:w="2469"/>
+          </w:tcPr>
+          <w:p>
+            <w:r/>
+            <w:r>
+              <w:rPr>
+                <w:rFonts w:ascii="Arial" w:hAnsi="Arial"/>
+                <w:b w:val="0"/>
+                <w:sz w:val="18"/>
+              </w:rPr>
+              <w:t>事件字典已定义。</w:t>
+            </w:r>
+          </w:p>
+        </w:tc>
+      </w:tr>
+      <w:tr>
+        <w:tc>
+          <w:tcPr>
+            <w:tcW w:type="dxa" w:w="2469"/>
+          </w:tcPr>
+          <w:p>
+            <w:r/>
+            <w:r>
+              <w:rPr>
+                <w:rFonts w:ascii="Arial" w:hAnsi="Arial"/>
+                <w:b w:val="0"/>
+                <w:sz w:val="18"/>
+              </w:rPr>
+              <w:t>booking_click</w:t>
+            </w:r>
+          </w:p>
+        </w:tc>
+        <w:tc>
+          <w:tcPr>
+            <w:tcW w:type="dxa" w:w="2469"/>
+          </w:tcPr>
+          <w:p>
+            <w:r/>
+            <w:r>
+              <w:rPr>
+                <w:rFonts w:ascii="Arial" w:hAnsi="Arial"/>
+                <w:b w:val="0"/>
+                <w:sz w:val="18"/>
+              </w:rPr>
+              <w:t>埋点</w:t>
+            </w:r>
+          </w:p>
+        </w:tc>
+        <w:tc>
+          <w:tcPr>
+            <w:tcW w:type="dxa" w:w="2469"/>
+          </w:tcPr>
+          <w:p>
+            <w:r/>
+            <w:r>
+              <w:rPr>
+                <w:rFonts w:ascii="Arial" w:hAnsi="Arial"/>
+                <w:b w:val="0"/>
+                <w:sz w:val="18"/>
+              </w:rPr>
+              <w:t>预约漏斗。</w:t>
+            </w:r>
+          </w:p>
+        </w:tc>
+        <w:tc>
+          <w:tcPr>
+            <w:tcW w:type="dxa" w:w="2469"/>
+          </w:tcPr>
+          <w:p>
+            <w:r/>
+            <w:r>
+              <w:rPr>
+                <w:rFonts w:ascii="Arial" w:hAnsi="Arial"/>
+                <w:b w:val="0"/>
+                <w:sz w:val="18"/>
+              </w:rPr>
+              <w:t>事件字典已定义。</w:t>
+            </w:r>
+          </w:p>
+        </w:tc>
+      </w:tr>
+      <w:tr>
+        <w:tc>
+          <w:tcPr>
+            <w:tcW w:type="dxa" w:w="2469"/>
+          </w:tcPr>
+          <w:p>
+            <w:r/>
+            <w:r>
+              <w:rPr>
+                <w:rFonts w:ascii="Arial" w:hAnsi="Arial"/>
+                <w:b w:val="0"/>
+                <w:sz w:val="18"/>
+              </w:rPr>
+              <w:t>comment_submit</w:t>
+            </w:r>
+          </w:p>
+        </w:tc>
+        <w:tc>
+          <w:tcPr>
+            <w:tcW w:type="dxa" w:w="2469"/>
+          </w:tcPr>
+          <w:p>
+            <w:r/>
+            <w:r>
+              <w:rPr>
+                <w:rFonts w:ascii="Arial" w:hAnsi="Arial"/>
+                <w:b w:val="0"/>
+                <w:sz w:val="18"/>
+              </w:rPr>
+              <w:t>埋点</w:t>
+            </w:r>
+          </w:p>
+        </w:tc>
+        <w:tc>
+          <w:tcPr>
+            <w:tcW w:type="dxa" w:w="2469"/>
+          </w:tcPr>
+          <w:p>
+            <w:r/>
+            <w:r>
+              <w:rPr>
+                <w:rFonts w:ascii="Arial" w:hAnsi="Arial"/>
+                <w:b w:val="0"/>
+                <w:sz w:val="18"/>
+              </w:rPr>
+              <w:t>社区活跃。</w:t>
+            </w:r>
+          </w:p>
+        </w:tc>
+        <w:tc>
+          <w:tcPr>
+            <w:tcW w:type="dxa" w:w="2469"/>
+          </w:tcPr>
+          <w:p>
+            <w:r/>
+            <w:r>
+              <w:rPr>
+                <w:rFonts w:ascii="Arial" w:hAnsi="Arial"/>
+                <w:b w:val="0"/>
+                <w:sz w:val="18"/>
+              </w:rPr>
+              <w:t>事件字典已定义。</w:t>
+            </w:r>
+          </w:p>
+        </w:tc>
+      </w:tr>
+      <w:tr>
+        <w:tc>
+          <w:tcPr>
+            <w:tcW w:type="dxa" w:w="2469"/>
+          </w:tcPr>
+          <w:p>
+            <w:r/>
+            <w:r>
+              <w:rPr>
+                <w:rFonts w:ascii="Arial" w:hAnsi="Arial"/>
+                <w:b w:val="0"/>
+                <w:sz w:val="18"/>
+              </w:rPr>
+              <w:t>favorite_toggle</w:t>
+            </w:r>
+          </w:p>
+        </w:tc>
+        <w:tc>
+          <w:tcPr>
+            <w:tcW w:type="dxa" w:w="2469"/>
+          </w:tcPr>
+          <w:p>
+            <w:r/>
+            <w:r>
+              <w:rPr>
+                <w:rFonts w:ascii="Arial" w:hAnsi="Arial"/>
+                <w:b w:val="0"/>
+                <w:sz w:val="18"/>
+              </w:rPr>
+              <w:t>埋点</w:t>
+            </w:r>
+          </w:p>
+        </w:tc>
+        <w:tc>
+          <w:tcPr>
+            <w:tcW w:type="dxa" w:w="2469"/>
+          </w:tcPr>
+          <w:p>
+            <w:r/>
+            <w:r>
+              <w:rPr>
+                <w:rFonts w:ascii="Arial" w:hAnsi="Arial"/>
+                <w:b w:val="0"/>
+                <w:sz w:val="18"/>
+              </w:rPr>
+              <w:t>我的沉淀、内容收藏率。</w:t>
+            </w:r>
+          </w:p>
+        </w:tc>
+        <w:tc>
+          <w:tcPr>
+            <w:tcW w:type="dxa" w:w="2469"/>
+          </w:tcPr>
+          <w:p>
+            <w:r/>
+            <w:r>
+              <w:rPr>
+                <w:rFonts w:ascii="Arial" w:hAnsi="Arial"/>
+                <w:b w:val="0"/>
+                <w:sz w:val="18"/>
+              </w:rPr>
+              <w:t>事件字典已定义。</w:t>
+            </w:r>
+          </w:p>
+        </w:tc>
+      </w:tr>
+    </w:tbl>
+    <w:p/>
+    <w:p>
+      <w:pPr>
+        <w:pStyle w:val="Heading2"/>
+      </w:pPr>
+      <w:r>
+        <w:t>17.4 当前实现边界</w:t>
+      </w:r>
+    </w:p>
+    <w:p>
+      <w:pPr>
+        <w:pStyle w:val="ListBullet"/>
+      </w:pPr>
+      <w:r>
+        <w:t>/admin 已可作为桌面管理后台入口，用于产品评审和运营流程确认。</w:t>
+      </w:r>
+    </w:p>
+    <w:p>
+      <w:pPr>
+        <w:pStyle w:val="ListBullet"/>
+      </w:pPr>
+      <w:r>
+        <w:t>后台首版基于现有静态数据推导看板，内容草稿保存在浏览器 localStorage。</w:t>
+      </w:r>
+    </w:p>
+    <w:p>
+      <w:pPr>
+        <w:pStyle w:val="ListBullet"/>
+      </w:pPr>
+      <w:r>
+        <w:t>Vercel 线上测试版可访问基础管理接口，但正式后台仍需要后台登录、数据库、权限、审计和审核队列。</w:t>
+      </w:r>
+    </w:p>
+    <w:p>
+      <w:pPr>
+        <w:pStyle w:val="ListBullet"/>
+      </w:pPr>
+      <w:r>
+        <w:t>生产化前必须接入数据库、对象存储、真实埋点 SDK、RBAC 权限和内容安全审核。</w:t>
+      </w:r>
+    </w:p>
     <w:sectPr>
       <w:pgSz w:w="12240" w:h="15840"/>
       <w:pgMar w:top="1080" w:right="1181" w:bottom="1080" w:left="1181" w:header="720" w:footer="720" w:gutter="0"/>

</xml_diff>